<commit_message>
Updated the question for spring bean life cycle
</commit_message>
<xml_diff>
--- a/spring/Spring Question.docx
+++ b/spring/Spring Question.docx
@@ -58,7 +58,7 @@
           <w:r>
             <w:fldChar w:fldCharType="separate"/>
           </w:r>
-          <w:hyperlink w:anchor="_Toc210285737" w:history="1">
+          <w:hyperlink w:anchor="_Toc211865440" w:history="1">
             <w:r>
               <w:rPr>
                 <w:rStyle w:val="Hyperlink"/>
@@ -85,7 +85,7 @@
                 <w:noProof/>
                 <w:webHidden/>
               </w:rPr>
-              <w:instrText xml:space="preserve"> PAGEREF _Toc210285737 \h </w:instrText>
+              <w:instrText xml:space="preserve"> PAGEREF _Toc211865440 \h </w:instrText>
             </w:r>
             <w:r>
               <w:rPr>
@@ -131,7 +131,7 @@
               <w:lang w:eastAsia="en-IN"/>
             </w:rPr>
           </w:pPr>
-          <w:hyperlink w:anchor="_Toc210285738" w:history="1">
+          <w:hyperlink w:anchor="_Toc211865441" w:history="1">
             <w:r>
               <w:rPr>
                 <w:rStyle w:val="Hyperlink"/>
@@ -177,7 +177,7 @@
                 <w:noProof/>
                 <w:webHidden/>
               </w:rPr>
-              <w:instrText xml:space="preserve"> PAGEREF _Toc210285738 \h </w:instrText>
+              <w:instrText xml:space="preserve"> PAGEREF _Toc211865441 \h </w:instrText>
             </w:r>
             <w:r>
               <w:rPr>
@@ -223,7 +223,7 @@
               <w:lang w:eastAsia="en-IN"/>
             </w:rPr>
           </w:pPr>
-          <w:hyperlink w:anchor="_Toc210285739" w:history="1">
+          <w:hyperlink w:anchor="_Toc211865442" w:history="1">
             <w:r>
               <w:rPr>
                 <w:rStyle w:val="Hyperlink"/>
@@ -269,7 +269,7 @@
                 <w:noProof/>
                 <w:webHidden/>
               </w:rPr>
-              <w:instrText xml:space="preserve"> PAGEREF _Toc210285739 \h </w:instrText>
+              <w:instrText xml:space="preserve"> PAGEREF _Toc211865442 \h </w:instrText>
             </w:r>
             <w:r>
               <w:rPr>
@@ -315,7 +315,7 @@
               <w:lang w:eastAsia="en-IN"/>
             </w:rPr>
           </w:pPr>
-          <w:hyperlink w:anchor="_Toc210285740" w:history="1">
+          <w:hyperlink w:anchor="_Toc211865443" w:history="1">
             <w:r>
               <w:rPr>
                 <w:rStyle w:val="Hyperlink"/>
@@ -361,7 +361,7 @@
                 <w:noProof/>
                 <w:webHidden/>
               </w:rPr>
-              <w:instrText xml:space="preserve"> PAGEREF _Toc210285740 \h </w:instrText>
+              <w:instrText xml:space="preserve"> PAGEREF _Toc211865443 \h </w:instrText>
             </w:r>
             <w:r>
               <w:rPr>
@@ -407,7 +407,7 @@
               <w:lang w:eastAsia="en-IN"/>
             </w:rPr>
           </w:pPr>
-          <w:hyperlink w:anchor="_Toc210285741" w:history="1">
+          <w:hyperlink w:anchor="_Toc211865444" w:history="1">
             <w:r>
               <w:rPr>
                 <w:rStyle w:val="Hyperlink"/>
@@ -453,7 +453,7 @@
                 <w:noProof/>
                 <w:webHidden/>
               </w:rPr>
-              <w:instrText xml:space="preserve"> PAGEREF _Toc210285741 \h </w:instrText>
+              <w:instrText xml:space="preserve"> PAGEREF _Toc211865444 \h </w:instrText>
             </w:r>
             <w:r>
               <w:rPr>
@@ -499,7 +499,7 @@
               <w:lang w:eastAsia="en-IN"/>
             </w:rPr>
           </w:pPr>
-          <w:hyperlink w:anchor="_Toc210285742" w:history="1">
+          <w:hyperlink w:anchor="_Toc211865445" w:history="1">
             <w:r>
               <w:rPr>
                 <w:rStyle w:val="Hyperlink"/>
@@ -545,7 +545,7 @@
                 <w:noProof/>
                 <w:webHidden/>
               </w:rPr>
-              <w:instrText xml:space="preserve"> PAGEREF _Toc210285742 \h </w:instrText>
+              <w:instrText xml:space="preserve"> PAGEREF _Toc211865445 \h </w:instrText>
             </w:r>
             <w:r>
               <w:rPr>
@@ -591,7 +591,7 @@
               <w:lang w:eastAsia="en-IN"/>
             </w:rPr>
           </w:pPr>
-          <w:hyperlink w:anchor="_Toc210285743" w:history="1">
+          <w:hyperlink w:anchor="_Toc211865446" w:history="1">
             <w:r>
               <w:rPr>
                 <w:rStyle w:val="Hyperlink"/>
@@ -637,7 +637,7 @@
                 <w:noProof/>
                 <w:webHidden/>
               </w:rPr>
-              <w:instrText xml:space="preserve"> PAGEREF _Toc210285743 \h </w:instrText>
+              <w:instrText xml:space="preserve"> PAGEREF _Toc211865446 \h </w:instrText>
             </w:r>
             <w:r>
               <w:rPr>
@@ -683,7 +683,7 @@
               <w:lang w:eastAsia="en-IN"/>
             </w:rPr>
           </w:pPr>
-          <w:hyperlink w:anchor="_Toc210285744" w:history="1">
+          <w:hyperlink w:anchor="_Toc211865447" w:history="1">
             <w:r>
               <w:rPr>
                 <w:rStyle w:val="Hyperlink"/>
@@ -729,7 +729,7 @@
                 <w:noProof/>
                 <w:webHidden/>
               </w:rPr>
-              <w:instrText xml:space="preserve"> PAGEREF _Toc210285744 \h </w:instrText>
+              <w:instrText xml:space="preserve"> PAGEREF _Toc211865447 \h </w:instrText>
             </w:r>
             <w:r>
               <w:rPr>
@@ -775,7 +775,7 @@
               <w:lang w:eastAsia="en-IN"/>
             </w:rPr>
           </w:pPr>
-          <w:hyperlink w:anchor="_Toc210285745" w:history="1">
+          <w:hyperlink w:anchor="_Toc211865448" w:history="1">
             <w:r>
               <w:rPr>
                 <w:rStyle w:val="Hyperlink"/>
@@ -821,7 +821,7 @@
                 <w:noProof/>
                 <w:webHidden/>
               </w:rPr>
-              <w:instrText xml:space="preserve"> PAGEREF _Toc210285745 \h </w:instrText>
+              <w:instrText xml:space="preserve"> PAGEREF _Toc211865448 \h </w:instrText>
             </w:r>
             <w:r>
               <w:rPr>
@@ -867,7 +867,7 @@
               <w:lang w:eastAsia="en-IN"/>
             </w:rPr>
           </w:pPr>
-          <w:hyperlink w:anchor="_Toc210285746" w:history="1">
+          <w:hyperlink w:anchor="_Toc211865449" w:history="1">
             <w:r>
               <w:rPr>
                 <w:rStyle w:val="Hyperlink"/>
@@ -913,7 +913,7 @@
                 <w:noProof/>
                 <w:webHidden/>
               </w:rPr>
-              <w:instrText xml:space="preserve"> PAGEREF _Toc210285746 \h </w:instrText>
+              <w:instrText xml:space="preserve"> PAGEREF _Toc211865449 \h </w:instrText>
             </w:r>
             <w:r>
               <w:rPr>
@@ -933,7 +933,7 @@
                 <w:noProof/>
                 <w:webHidden/>
               </w:rPr>
-              <w:t>15</w:t>
+              <w:t>13</w:t>
             </w:r>
             <w:r>
               <w:rPr>
@@ -959,7 +959,7 @@
               <w:lang w:eastAsia="en-IN"/>
             </w:rPr>
           </w:pPr>
-          <w:hyperlink w:anchor="_Toc210285747" w:history="1">
+          <w:hyperlink w:anchor="_Toc211865450" w:history="1">
             <w:r>
               <w:rPr>
                 <w:rStyle w:val="Hyperlink"/>
@@ -1005,7 +1005,7 @@
                 <w:noProof/>
                 <w:webHidden/>
               </w:rPr>
-              <w:instrText xml:space="preserve"> PAGEREF _Toc210285747 \h </w:instrText>
+              <w:instrText xml:space="preserve"> PAGEREF _Toc211865450 \h </w:instrText>
             </w:r>
             <w:r>
               <w:rPr>
@@ -1025,7 +1025,7 @@
                 <w:noProof/>
                 <w:webHidden/>
               </w:rPr>
-              <w:t>16</w:t>
+              <w:t>14</w:t>
             </w:r>
             <w:r>
               <w:rPr>
@@ -1051,7 +1051,7 @@
               <w:lang w:eastAsia="en-IN"/>
             </w:rPr>
           </w:pPr>
-          <w:hyperlink w:anchor="_Toc210285748" w:history="1">
+          <w:hyperlink w:anchor="_Toc211865451" w:history="1">
             <w:r>
               <w:rPr>
                 <w:rStyle w:val="Hyperlink"/>
@@ -1097,7 +1097,7 @@
                 <w:noProof/>
                 <w:webHidden/>
               </w:rPr>
-              <w:instrText xml:space="preserve"> PAGEREF _Toc210285748 \h </w:instrText>
+              <w:instrText xml:space="preserve"> PAGEREF _Toc211865451 \h </w:instrText>
             </w:r>
             <w:r>
               <w:rPr>
@@ -1117,7 +1117,7 @@
                 <w:noProof/>
                 <w:webHidden/>
               </w:rPr>
-              <w:t>16</w:t>
+              <w:t>14</w:t>
             </w:r>
             <w:r>
               <w:rPr>
@@ -1143,7 +1143,7 @@
               <w:lang w:eastAsia="en-IN"/>
             </w:rPr>
           </w:pPr>
-          <w:hyperlink w:anchor="_Toc210285749" w:history="1">
+          <w:hyperlink w:anchor="_Toc211865452" w:history="1">
             <w:r>
               <w:rPr>
                 <w:rStyle w:val="Hyperlink"/>
@@ -1189,7 +1189,7 @@
                 <w:noProof/>
                 <w:webHidden/>
               </w:rPr>
-              <w:instrText xml:space="preserve"> PAGEREF _Toc210285749 \h </w:instrText>
+              <w:instrText xml:space="preserve"> PAGEREF _Toc211865452 \h </w:instrText>
             </w:r>
             <w:r>
               <w:rPr>
@@ -1209,7 +1209,7 @@
                 <w:noProof/>
                 <w:webHidden/>
               </w:rPr>
-              <w:t>16</w:t>
+              <w:t>14</w:t>
             </w:r>
             <w:r>
               <w:rPr>
@@ -1235,7 +1235,7 @@
               <w:lang w:eastAsia="en-IN"/>
             </w:rPr>
           </w:pPr>
-          <w:hyperlink w:anchor="_Toc210285750" w:history="1">
+          <w:hyperlink w:anchor="_Toc211865453" w:history="1">
             <w:r>
               <w:rPr>
                 <w:rStyle w:val="Hyperlink"/>
@@ -1281,7 +1281,7 @@
                 <w:noProof/>
                 <w:webHidden/>
               </w:rPr>
-              <w:instrText xml:space="preserve"> PAGEREF _Toc210285750 \h </w:instrText>
+              <w:instrText xml:space="preserve"> PAGEREF _Toc211865453 \h </w:instrText>
             </w:r>
             <w:r>
               <w:rPr>
@@ -1301,7 +1301,7 @@
                 <w:noProof/>
                 <w:webHidden/>
               </w:rPr>
-              <w:t>16</w:t>
+              <w:t>14</w:t>
             </w:r>
             <w:r>
               <w:rPr>
@@ -1327,7 +1327,7 @@
               <w:lang w:eastAsia="en-IN"/>
             </w:rPr>
           </w:pPr>
-          <w:hyperlink w:anchor="_Toc210285751" w:history="1">
+          <w:hyperlink w:anchor="_Toc211865454" w:history="1">
             <w:r>
               <w:rPr>
                 <w:rStyle w:val="Hyperlink"/>
@@ -1373,7 +1373,7 @@
                 <w:noProof/>
                 <w:webHidden/>
               </w:rPr>
-              <w:instrText xml:space="preserve"> PAGEREF _Toc210285751 \h </w:instrText>
+              <w:instrText xml:space="preserve"> PAGEREF _Toc211865454 \h </w:instrText>
             </w:r>
             <w:r>
               <w:rPr>
@@ -1393,7 +1393,7 @@
                 <w:noProof/>
                 <w:webHidden/>
               </w:rPr>
-              <w:t>16</w:t>
+              <w:t>14</w:t>
             </w:r>
             <w:r>
               <w:rPr>
@@ -1418,7 +1418,7 @@
               <w:lang w:eastAsia="en-IN"/>
             </w:rPr>
           </w:pPr>
-          <w:hyperlink w:anchor="_Toc210285752" w:history="1">
+          <w:hyperlink w:anchor="_Toc211865455" w:history="1">
             <w:r>
               <w:rPr>
                 <w:rStyle w:val="Hyperlink"/>
@@ -1445,7 +1445,7 @@
                 <w:noProof/>
                 <w:webHidden/>
               </w:rPr>
-              <w:instrText xml:space="preserve"> PAGEREF _Toc210285752 \h </w:instrText>
+              <w:instrText xml:space="preserve"> PAGEREF _Toc211865455 \h </w:instrText>
             </w:r>
             <w:r>
               <w:rPr>
@@ -1465,7 +1465,7 @@
                 <w:noProof/>
                 <w:webHidden/>
               </w:rPr>
-              <w:t>18</w:t>
+              <w:t>16</w:t>
             </w:r>
             <w:r>
               <w:rPr>
@@ -1491,7 +1491,7 @@
               <w:lang w:eastAsia="en-IN"/>
             </w:rPr>
           </w:pPr>
-          <w:hyperlink w:anchor="_Toc210285753" w:history="1">
+          <w:hyperlink w:anchor="_Toc211865456" w:history="1">
             <w:r>
               <w:rPr>
                 <w:rStyle w:val="Hyperlink"/>
@@ -1537,7 +1537,7 @@
                 <w:noProof/>
                 <w:webHidden/>
               </w:rPr>
-              <w:instrText xml:space="preserve"> PAGEREF _Toc210285753 \h </w:instrText>
+              <w:instrText xml:space="preserve"> PAGEREF _Toc211865456 \h </w:instrText>
             </w:r>
             <w:r>
               <w:rPr>
@@ -1557,7 +1557,7 @@
                 <w:noProof/>
                 <w:webHidden/>
               </w:rPr>
-              <w:t>18</w:t>
+              <w:t>16</w:t>
             </w:r>
             <w:r>
               <w:rPr>
@@ -1583,7 +1583,7 @@
               <w:lang w:eastAsia="en-IN"/>
             </w:rPr>
           </w:pPr>
-          <w:hyperlink w:anchor="_Toc210285754" w:history="1">
+          <w:hyperlink w:anchor="_Toc211865457" w:history="1">
             <w:r>
               <w:rPr>
                 <w:rStyle w:val="Hyperlink"/>
@@ -1629,7 +1629,7 @@
                 <w:noProof/>
                 <w:webHidden/>
               </w:rPr>
-              <w:instrText xml:space="preserve"> PAGEREF _Toc210285754 \h </w:instrText>
+              <w:instrText xml:space="preserve"> PAGEREF _Toc211865457 \h </w:instrText>
             </w:r>
             <w:r>
               <w:rPr>
@@ -1649,7 +1649,7 @@
                 <w:noProof/>
                 <w:webHidden/>
               </w:rPr>
-              <w:t>18</w:t>
+              <w:t>16</w:t>
             </w:r>
             <w:r>
               <w:rPr>
@@ -1675,7 +1675,7 @@
               <w:lang w:eastAsia="en-IN"/>
             </w:rPr>
           </w:pPr>
-          <w:hyperlink w:anchor="_Toc210285755" w:history="1">
+          <w:hyperlink w:anchor="_Toc211865458" w:history="1">
             <w:r>
               <w:rPr>
                 <w:rStyle w:val="Hyperlink"/>
@@ -1721,7 +1721,7 @@
                 <w:noProof/>
                 <w:webHidden/>
               </w:rPr>
-              <w:instrText xml:space="preserve"> PAGEREF _Toc210285755 \h </w:instrText>
+              <w:instrText xml:space="preserve"> PAGEREF _Toc211865458 \h </w:instrText>
             </w:r>
             <w:r>
               <w:rPr>
@@ -1741,7 +1741,7 @@
                 <w:noProof/>
                 <w:webHidden/>
               </w:rPr>
-              <w:t>18</w:t>
+              <w:t>16</w:t>
             </w:r>
             <w:r>
               <w:rPr>
@@ -1767,7 +1767,7 @@
               <w:lang w:eastAsia="en-IN"/>
             </w:rPr>
           </w:pPr>
-          <w:hyperlink w:anchor="_Toc210285756" w:history="1">
+          <w:hyperlink w:anchor="_Toc211865459" w:history="1">
             <w:r>
               <w:rPr>
                 <w:rStyle w:val="Hyperlink"/>
@@ -1813,7 +1813,7 @@
                 <w:noProof/>
                 <w:webHidden/>
               </w:rPr>
-              <w:instrText xml:space="preserve"> PAGEREF _Toc210285756 \h </w:instrText>
+              <w:instrText xml:space="preserve"> PAGEREF _Toc211865459 \h </w:instrText>
             </w:r>
             <w:r>
               <w:rPr>
@@ -1833,7 +1833,7 @@
                 <w:noProof/>
                 <w:webHidden/>
               </w:rPr>
-              <w:t>20</w:t>
+              <w:t>18</w:t>
             </w:r>
             <w:r>
               <w:rPr>
@@ -1859,7 +1859,7 @@
               <w:lang w:eastAsia="en-IN"/>
             </w:rPr>
           </w:pPr>
-          <w:hyperlink w:anchor="_Toc210285757" w:history="1">
+          <w:hyperlink w:anchor="_Toc211865460" w:history="1">
             <w:r>
               <w:rPr>
                 <w:rStyle w:val="Hyperlink"/>
@@ -1905,7 +1905,7 @@
                 <w:noProof/>
                 <w:webHidden/>
               </w:rPr>
-              <w:instrText xml:space="preserve"> PAGEREF _Toc210285757 \h </w:instrText>
+              <w:instrText xml:space="preserve"> PAGEREF _Toc211865460 \h </w:instrText>
             </w:r>
             <w:r>
               <w:rPr>
@@ -1925,7 +1925,7 @@
                 <w:noProof/>
                 <w:webHidden/>
               </w:rPr>
-              <w:t>20</w:t>
+              <w:t>18</w:t>
             </w:r>
             <w:r>
               <w:rPr>
@@ -1951,7 +1951,7 @@
               <w:lang w:eastAsia="en-IN"/>
             </w:rPr>
           </w:pPr>
-          <w:hyperlink w:anchor="_Toc210285758" w:history="1">
+          <w:hyperlink w:anchor="_Toc211865461" w:history="1">
             <w:r>
               <w:rPr>
                 <w:rStyle w:val="Hyperlink"/>
@@ -1997,7 +1997,7 @@
                 <w:noProof/>
                 <w:webHidden/>
               </w:rPr>
-              <w:instrText xml:space="preserve"> PAGEREF _Toc210285758 \h </w:instrText>
+              <w:instrText xml:space="preserve"> PAGEREF _Toc211865461 \h </w:instrText>
             </w:r>
             <w:r>
               <w:rPr>
@@ -2017,7 +2017,7 @@
                 <w:noProof/>
                 <w:webHidden/>
               </w:rPr>
-              <w:t>20</w:t>
+              <w:t>18</w:t>
             </w:r>
             <w:r>
               <w:rPr>
@@ -2043,7 +2043,7 @@
               <w:lang w:eastAsia="en-IN"/>
             </w:rPr>
           </w:pPr>
-          <w:hyperlink w:anchor="_Toc210285759" w:history="1">
+          <w:hyperlink w:anchor="_Toc211865462" w:history="1">
             <w:r>
               <w:rPr>
                 <w:rStyle w:val="Hyperlink"/>
@@ -2087,7 +2087,7 @@
                 <w:noProof/>
                 <w:webHidden/>
               </w:rPr>
-              <w:instrText xml:space="preserve"> PAGEREF _Toc210285759 \h </w:instrText>
+              <w:instrText xml:space="preserve"> PAGEREF _Toc211865462 \h </w:instrText>
             </w:r>
             <w:r>
               <w:rPr>
@@ -2107,7 +2107,7 @@
                 <w:noProof/>
                 <w:webHidden/>
               </w:rPr>
-              <w:t>20</w:t>
+              <w:t>18</w:t>
             </w:r>
             <w:r>
               <w:rPr>
@@ -2133,7 +2133,7 @@
               <w:lang w:eastAsia="en-IN"/>
             </w:rPr>
           </w:pPr>
-          <w:hyperlink w:anchor="_Toc210285760" w:history="1">
+          <w:hyperlink w:anchor="_Toc211865463" w:history="1">
             <w:r>
               <w:rPr>
                 <w:rStyle w:val="Hyperlink"/>
@@ -2177,7 +2177,7 @@
                 <w:noProof/>
                 <w:webHidden/>
               </w:rPr>
-              <w:instrText xml:space="preserve"> PAGEREF _Toc210285760 \h </w:instrText>
+              <w:instrText xml:space="preserve"> PAGEREF _Toc211865463 \h </w:instrText>
             </w:r>
             <w:r>
               <w:rPr>
@@ -2197,7 +2197,7 @@
                 <w:noProof/>
                 <w:webHidden/>
               </w:rPr>
-              <w:t>21</w:t>
+              <w:t>19</w:t>
             </w:r>
             <w:r>
               <w:rPr>
@@ -2223,7 +2223,7 @@
               <w:lang w:eastAsia="en-IN"/>
             </w:rPr>
           </w:pPr>
-          <w:hyperlink w:anchor="_Toc210285761" w:history="1">
+          <w:hyperlink w:anchor="_Toc211865464" w:history="1">
             <w:r>
               <w:rPr>
                 <w:rStyle w:val="Hyperlink"/>
@@ -2267,7 +2267,7 @@
                 <w:noProof/>
                 <w:webHidden/>
               </w:rPr>
-              <w:instrText xml:space="preserve"> PAGEREF _Toc210285761 \h </w:instrText>
+              <w:instrText xml:space="preserve"> PAGEREF _Toc211865464 \h </w:instrText>
             </w:r>
             <w:r>
               <w:rPr>
@@ -2287,7 +2287,7 @@
                 <w:noProof/>
                 <w:webHidden/>
               </w:rPr>
-              <w:t>23</w:t>
+              <w:t>21</w:t>
             </w:r>
             <w:r>
               <w:rPr>
@@ -2313,7 +2313,7 @@
               <w:lang w:eastAsia="en-IN"/>
             </w:rPr>
           </w:pPr>
-          <w:hyperlink w:anchor="_Toc210285762" w:history="1">
+          <w:hyperlink w:anchor="_Toc211865465" w:history="1">
             <w:r>
               <w:rPr>
                 <w:rStyle w:val="Hyperlink"/>
@@ -2357,7 +2357,7 @@
                 <w:noProof/>
                 <w:webHidden/>
               </w:rPr>
-              <w:instrText xml:space="preserve"> PAGEREF _Toc210285762 \h </w:instrText>
+              <w:instrText xml:space="preserve"> PAGEREF _Toc211865465 \h </w:instrText>
             </w:r>
             <w:r>
               <w:rPr>
@@ -2377,7 +2377,7 @@
                 <w:noProof/>
                 <w:webHidden/>
               </w:rPr>
-              <w:t>23</w:t>
+              <w:t>21</w:t>
             </w:r>
             <w:r>
               <w:rPr>
@@ -2403,7 +2403,7 @@
               <w:lang w:eastAsia="en-IN"/>
             </w:rPr>
           </w:pPr>
-          <w:hyperlink w:anchor="_Toc210285763" w:history="1">
+          <w:hyperlink w:anchor="_Toc211865466" w:history="1">
             <w:r>
               <w:rPr>
                 <w:rStyle w:val="Hyperlink"/>
@@ -2447,7 +2447,7 @@
                 <w:noProof/>
                 <w:webHidden/>
               </w:rPr>
-              <w:instrText xml:space="preserve"> PAGEREF _Toc210285763 \h </w:instrText>
+              <w:instrText xml:space="preserve"> PAGEREF _Toc211865466 \h </w:instrText>
             </w:r>
             <w:r>
               <w:rPr>
@@ -2467,7 +2467,7 @@
                 <w:noProof/>
                 <w:webHidden/>
               </w:rPr>
-              <w:t>24</w:t>
+              <w:t>22</w:t>
             </w:r>
             <w:r>
               <w:rPr>
@@ -2493,7 +2493,7 @@
               <w:lang w:eastAsia="en-IN"/>
             </w:rPr>
           </w:pPr>
-          <w:hyperlink w:anchor="_Toc210285764" w:history="1">
+          <w:hyperlink w:anchor="_Toc211865467" w:history="1">
             <w:r>
               <w:rPr>
                 <w:rStyle w:val="Hyperlink"/>
@@ -2537,7 +2537,7 @@
                 <w:noProof/>
                 <w:webHidden/>
               </w:rPr>
-              <w:instrText xml:space="preserve"> PAGEREF _Toc210285764 \h </w:instrText>
+              <w:instrText xml:space="preserve"> PAGEREF _Toc211865467 \h </w:instrText>
             </w:r>
             <w:r>
               <w:rPr>
@@ -2557,7 +2557,7 @@
                 <w:noProof/>
                 <w:webHidden/>
               </w:rPr>
-              <w:t>25</w:t>
+              <w:t>23</w:t>
             </w:r>
             <w:r>
               <w:rPr>
@@ -2583,7 +2583,7 @@
               <w:lang w:eastAsia="en-IN"/>
             </w:rPr>
           </w:pPr>
-          <w:hyperlink w:anchor="_Toc210285765" w:history="1">
+          <w:hyperlink w:anchor="_Toc211865468" w:history="1">
             <w:r>
               <w:rPr>
                 <w:rStyle w:val="Hyperlink"/>
@@ -2627,7 +2627,7 @@
                 <w:noProof/>
                 <w:webHidden/>
               </w:rPr>
-              <w:instrText xml:space="preserve"> PAGEREF _Toc210285765 \h </w:instrText>
+              <w:instrText xml:space="preserve"> PAGEREF _Toc211865468 \h </w:instrText>
             </w:r>
             <w:r>
               <w:rPr>
@@ -2647,7 +2647,7 @@
                 <w:noProof/>
                 <w:webHidden/>
               </w:rPr>
-              <w:t>26</w:t>
+              <w:t>24</w:t>
             </w:r>
             <w:r>
               <w:rPr>
@@ -2673,7 +2673,7 @@
               <w:lang w:eastAsia="en-IN"/>
             </w:rPr>
           </w:pPr>
-          <w:hyperlink w:anchor="_Toc210285766" w:history="1">
+          <w:hyperlink w:anchor="_Toc211865469" w:history="1">
             <w:r>
               <w:rPr>
                 <w:rStyle w:val="Hyperlink"/>
@@ -2717,7 +2717,7 @@
                 <w:noProof/>
                 <w:webHidden/>
               </w:rPr>
-              <w:instrText xml:space="preserve"> PAGEREF _Toc210285766 \h </w:instrText>
+              <w:instrText xml:space="preserve"> PAGEREF _Toc211865469 \h </w:instrText>
             </w:r>
             <w:r>
               <w:rPr>
@@ -2737,7 +2737,7 @@
                 <w:noProof/>
                 <w:webHidden/>
               </w:rPr>
-              <w:t>26</w:t>
+              <w:t>24</w:t>
             </w:r>
             <w:r>
               <w:rPr>
@@ -2763,7 +2763,7 @@
               <w:lang w:eastAsia="en-IN"/>
             </w:rPr>
           </w:pPr>
-          <w:hyperlink w:anchor="_Toc210285767" w:history="1">
+          <w:hyperlink w:anchor="_Toc211865470" w:history="1">
             <w:r>
               <w:rPr>
                 <w:rStyle w:val="Hyperlink"/>
@@ -2807,7 +2807,7 @@
                 <w:noProof/>
                 <w:webHidden/>
               </w:rPr>
-              <w:instrText xml:space="preserve"> PAGEREF _Toc210285767 \h </w:instrText>
+              <w:instrText xml:space="preserve"> PAGEREF _Toc211865470 \h </w:instrText>
             </w:r>
             <w:r>
               <w:rPr>
@@ -2827,7 +2827,7 @@
                 <w:noProof/>
                 <w:webHidden/>
               </w:rPr>
-              <w:t>26</w:t>
+              <w:t>24</w:t>
             </w:r>
             <w:r>
               <w:rPr>
@@ -2852,7 +2852,7 @@
               <w:lang w:eastAsia="en-IN"/>
             </w:rPr>
           </w:pPr>
-          <w:hyperlink w:anchor="_Toc210285768" w:history="1">
+          <w:hyperlink w:anchor="_Toc211865471" w:history="1">
             <w:r>
               <w:rPr>
                 <w:rStyle w:val="Hyperlink"/>
@@ -2879,7 +2879,7 @@
                 <w:noProof/>
                 <w:webHidden/>
               </w:rPr>
-              <w:instrText xml:space="preserve"> PAGEREF _Toc210285768 \h </w:instrText>
+              <w:instrText xml:space="preserve"> PAGEREF _Toc211865471 \h </w:instrText>
             </w:r>
             <w:r>
               <w:rPr>
@@ -2899,7 +2899,7 @@
                 <w:noProof/>
                 <w:webHidden/>
               </w:rPr>
-              <w:t>28</w:t>
+              <w:t>26</w:t>
             </w:r>
             <w:r>
               <w:rPr>
@@ -2925,7 +2925,7 @@
               <w:lang w:eastAsia="en-IN"/>
             </w:rPr>
           </w:pPr>
-          <w:hyperlink w:anchor="_Toc210285769" w:history="1">
+          <w:hyperlink w:anchor="_Toc211865472" w:history="1">
             <w:r>
               <w:rPr>
                 <w:rStyle w:val="Hyperlink"/>
@@ -2969,7 +2969,7 @@
                 <w:noProof/>
                 <w:webHidden/>
               </w:rPr>
-              <w:instrText xml:space="preserve"> PAGEREF _Toc210285769 \h </w:instrText>
+              <w:instrText xml:space="preserve"> PAGEREF _Toc211865472 \h </w:instrText>
             </w:r>
             <w:r>
               <w:rPr>
@@ -2989,7 +2989,7 @@
                 <w:noProof/>
                 <w:webHidden/>
               </w:rPr>
-              <w:t>28</w:t>
+              <w:t>26</w:t>
             </w:r>
             <w:r>
               <w:rPr>
@@ -3050,7 +3050,7 @@
       <w:pPr>
         <w:pStyle w:val="Heading2"/>
       </w:pPr>
-      <w:bookmarkStart w:id="0" w:name="_Toc210285737"/>
+      <w:bookmarkStart w:id="0" w:name="_Toc211865440"/>
       <w:r>
         <w:lastRenderedPageBreak/>
         <w:t>Spring Core</w:t>
@@ -3068,7 +3068,7 @@
           <w:bdr w:val="none" w:sz="0" w:space="0" w:color="auto" w:frame="1"/>
         </w:rPr>
       </w:pPr>
-      <w:bookmarkStart w:id="1" w:name="_Toc210285738"/>
+      <w:bookmarkStart w:id="1" w:name="_Toc211865441"/>
       <w:r>
         <w:rPr>
           <w:bdr w:val="none" w:sz="0" w:space="0" w:color="auto" w:frame="1"/>
@@ -3107,7 +3107,7 @@
           <w:bdr w:val="none" w:sz="0" w:space="0" w:color="auto" w:frame="1"/>
         </w:rPr>
       </w:pPr>
-      <w:bookmarkStart w:id="2" w:name="_Toc210285739"/>
+      <w:bookmarkStart w:id="2" w:name="_Toc211865442"/>
       <w:r>
         <w:rPr>
           <w:bdr w:val="none" w:sz="0" w:space="0" w:color="auto" w:frame="1"/>
@@ -3434,7 +3434,7 @@
           <w:bdr w:val="none" w:sz="0" w:space="0" w:color="auto" w:frame="1"/>
         </w:rPr>
       </w:pPr>
-      <w:bookmarkStart w:id="3" w:name="_Toc210285740"/>
+      <w:bookmarkStart w:id="3" w:name="_Toc211865443"/>
       <w:r>
         <w:rPr>
           <w:bdr w:val="none" w:sz="0" w:space="0" w:color="auto" w:frame="1"/>
@@ -4388,7 +4388,7 @@
           <w:bdr w:val="none" w:sz="0" w:space="0" w:color="auto" w:frame="1"/>
         </w:rPr>
       </w:pPr>
-      <w:bookmarkStart w:id="4" w:name="_Toc210285741"/>
+      <w:bookmarkStart w:id="4" w:name="_Toc211865444"/>
       <w:r>
         <w:rPr>
           <w:bdr w:val="none" w:sz="0" w:space="0" w:color="auto" w:frame="1"/>
@@ -5032,7 +5032,7 @@
           <w:bdr w:val="none" w:sz="0" w:space="0" w:color="auto" w:frame="1"/>
         </w:rPr>
       </w:pPr>
-      <w:bookmarkStart w:id="5" w:name="_Toc210285742"/>
+      <w:bookmarkStart w:id="5" w:name="_Toc211865445"/>
       <w:r>
         <w:rPr>
           <w:bdr w:val="none" w:sz="0" w:space="0" w:color="auto" w:frame="1"/>
@@ -5908,7 +5908,7 @@
           <w:bdr w:val="none" w:sz="0" w:space="0" w:color="auto" w:frame="1"/>
         </w:rPr>
       </w:pPr>
-      <w:bookmarkStart w:id="6" w:name="_Toc210285743"/>
+      <w:bookmarkStart w:id="6" w:name="_Toc211865446"/>
       <w:r>
         <w:rPr>
           <w:bdr w:val="none" w:sz="0" w:space="0" w:color="auto" w:frame="1"/>
@@ -6232,7 +6232,7 @@
           <w:bdr w:val="none" w:sz="0" w:space="0" w:color="auto" w:frame="1"/>
         </w:rPr>
       </w:pPr>
-      <w:bookmarkStart w:id="7" w:name="_Toc210285744"/>
+      <w:bookmarkStart w:id="7" w:name="_Toc211865447"/>
       <w:r>
         <w:rPr>
           <w:bdr w:val="none" w:sz="0" w:space="0" w:color="auto" w:frame="1"/>
@@ -6769,7 +6769,7 @@
           <w:bdr w:val="none" w:sz="0" w:space="0" w:color="auto" w:frame="1"/>
         </w:rPr>
       </w:pPr>
-      <w:bookmarkStart w:id="8" w:name="_Toc210285745"/>
+      <w:bookmarkStart w:id="8" w:name="_Toc211865448"/>
       <w:r>
         <w:rPr>
           <w:bdr w:val="none" w:sz="0" w:space="0" w:color="auto" w:frame="1"/>
@@ -6781,24 +6781,17 @@
     </w:p>
     <w:p>
       <w:pPr>
-        <w:rPr>
-          <w:b/>
-          <w:bCs/>
-        </w:rPr>
-      </w:pPr>
-      <w:r>
-        <w:rPr>
-          <w:b/>
-          <w:bCs/>
-        </w:rPr>
-        <w:t>Bean Lifecycle Flow (Step by Step)</w:t>
+        <w:ind w:firstLine="360"/>
+      </w:pPr>
+      <w:r>
+        <w:t>The lifecycle of a Spring bean consists of the following phases, which are listed below</w:t>
       </w:r>
     </w:p>
     <w:p>
       <w:pPr>
         <w:numPr>
           <w:ilvl w:val="0"/>
-          <w:numId w:val="25"/>
+          <w:numId w:val="54"/>
         </w:numPr>
       </w:pPr>
       <w:r>
@@ -6806,17 +6799,17 @@
           <w:b/>
           <w:bCs/>
         </w:rPr>
-        <w:t>Instantiate</w:t>
-      </w:r>
-      <w:r>
-        <w:t xml:space="preserve"> → Object created.</w:t>
+        <w:t>Container Started: </w:t>
+      </w:r>
+      <w:r>
+        <w:t>The Spring IoC container is initialized.</w:t>
       </w:r>
     </w:p>
     <w:p>
       <w:pPr>
         <w:numPr>
           <w:ilvl w:val="0"/>
-          <w:numId w:val="25"/>
+          <w:numId w:val="55"/>
         </w:numPr>
       </w:pPr>
       <w:r>
@@ -6824,17 +6817,17 @@
           <w:b/>
           <w:bCs/>
         </w:rPr>
-        <w:t>Populate Properties</w:t>
-      </w:r>
-      <w:r>
-        <w:t xml:space="preserve"> → Dependencies injected.</w:t>
+        <w:t>Bean Instantiated:</w:t>
+      </w:r>
+      <w:r>
+        <w:t> The container creates an instance of the bean.</w:t>
       </w:r>
     </w:p>
     <w:p>
       <w:pPr>
         <w:numPr>
           <w:ilvl w:val="0"/>
-          <w:numId w:val="25"/>
+          <w:numId w:val="56"/>
         </w:numPr>
       </w:pPr>
       <w:r>
@@ -6842,33 +6835,17 @@
           <w:b/>
           <w:bCs/>
         </w:rPr>
-        <w:t>Aware Interfaces</w:t>
-      </w:r>
-      <w:r>
-        <w:t xml:space="preserve"> → </w:t>
-      </w:r>
-      <w:proofErr w:type="spellStart"/>
-      <w:r>
-        <w:t>BeanNameAware</w:t>
-      </w:r>
-      <w:proofErr w:type="spellEnd"/>
-      <w:r>
-        <w:t xml:space="preserve">, </w:t>
-      </w:r>
-      <w:proofErr w:type="spellStart"/>
-      <w:r>
-        <w:t>BeanFactoryAware</w:t>
-      </w:r>
-      <w:proofErr w:type="spellEnd"/>
-      <w:r>
-        <w:t>, etc. called.</w:t>
+        <w:t>Dependencies Injected: </w:t>
+      </w:r>
+      <w:r>
+        <w:t>The container injects the dependencies into the bean.</w:t>
       </w:r>
     </w:p>
     <w:p>
       <w:pPr>
         <w:numPr>
           <w:ilvl w:val="0"/>
-          <w:numId w:val="25"/>
+          <w:numId w:val="57"/>
         </w:numPr>
       </w:pPr>
       <w:r>
@@ -6876,36 +6853,58 @@
           <w:b/>
           <w:bCs/>
         </w:rPr>
-        <w:t>Pre-Initialization</w:t>
-      </w:r>
-      <w:r>
-        <w:t xml:space="preserve"> → </w:t>
+        <w:t xml:space="preserve">Custom </w:t>
       </w:r>
       <w:proofErr w:type="spellStart"/>
-      <w:r>
-        <w:t>BeanPostProcessor</w:t>
+      <w:proofErr w:type="gramStart"/>
+      <w:r>
+        <w:rPr>
+          <w:b/>
+          <w:bCs/>
+        </w:rPr>
+        <w:t>init</w:t>
       </w:r>
       <w:proofErr w:type="spellEnd"/>
       <w:r>
-        <w:t>.</w:t>
-      </w:r>
-      <w:r>
-        <w:t xml:space="preserve"> </w:t>
+        <w:rPr>
+          <w:b/>
+          <w:bCs/>
+        </w:rPr>
+        <w:t>(</w:t>
+      </w:r>
+      <w:proofErr w:type="gramEnd"/>
+      <w:r>
+        <w:rPr>
+          <w:b/>
+          <w:bCs/>
+        </w:rPr>
+        <w:t>) method:</w:t>
+      </w:r>
+      <w:r>
+        <w:t xml:space="preserve"> If the bean implements </w:t>
       </w:r>
       <w:proofErr w:type="spellStart"/>
       <w:r>
-        <w:t>postProcessBeforeInitialization</w:t>
+        <w:t>InitializingBean</w:t>
       </w:r>
       <w:proofErr w:type="spellEnd"/>
       <w:r>
-        <w:t>().</w:t>
+        <w:t xml:space="preserve"> or has a custom initialization method specified via @PostConstruct or </w:t>
+      </w:r>
+      <w:proofErr w:type="spellStart"/>
+      <w:r>
+        <w:t>init</w:t>
+      </w:r>
+      <w:proofErr w:type="spellEnd"/>
+      <w:r>
+        <w:t>-method.</w:t>
       </w:r>
     </w:p>
     <w:p>
       <w:pPr>
         <w:numPr>
           <w:ilvl w:val="0"/>
-          <w:numId w:val="25"/>
+          <w:numId w:val="58"/>
         </w:numPr>
       </w:pPr>
       <w:r>
@@ -6913,38 +6912,17 @@
           <w:b/>
           <w:bCs/>
         </w:rPr>
-        <w:t>Initialization</w:t>
-      </w:r>
-      <w:r>
-        <w:t xml:space="preserve"> → @PostConstruct, </w:t>
-      </w:r>
-      <w:proofErr w:type="spellStart"/>
-      <w:proofErr w:type="gramStart"/>
-      <w:r>
-        <w:t>afterPropertiesSet</w:t>
-      </w:r>
-      <w:proofErr w:type="spellEnd"/>
-      <w:r>
-        <w:t>(</w:t>
-      </w:r>
-      <w:proofErr w:type="gramEnd"/>
-      <w:r>
-        <w:t xml:space="preserve">), </w:t>
-      </w:r>
-      <w:proofErr w:type="spellStart"/>
-      <w:r>
-        <w:t>init</w:t>
-      </w:r>
-      <w:proofErr w:type="spellEnd"/>
-      <w:r>
-        <w:t>-method.</w:t>
+        <w:t>Bean is Ready: </w:t>
+      </w:r>
+      <w:r>
+        <w:t>The bean is now fully initialized and ready to be used.</w:t>
       </w:r>
     </w:p>
     <w:p>
       <w:pPr>
         <w:numPr>
           <w:ilvl w:val="0"/>
-          <w:numId w:val="25"/>
+          <w:numId w:val="59"/>
         </w:numPr>
       </w:pPr>
       <w:r>
@@ -6952,36 +6930,17 @@
           <w:b/>
           <w:bCs/>
         </w:rPr>
-        <w:t>Post-Initialization</w:t>
-      </w:r>
-      <w:r>
-        <w:t xml:space="preserve"> → </w:t>
-      </w:r>
-      <w:proofErr w:type="spellStart"/>
-      <w:r>
-        <w:t>BeanPostProcessor</w:t>
-      </w:r>
-      <w:proofErr w:type="spellEnd"/>
-      <w:r>
-        <w:t>.</w:t>
-      </w:r>
-      <w:r>
-        <w:t xml:space="preserve"> </w:t>
-      </w:r>
-      <w:proofErr w:type="spellStart"/>
-      <w:r>
-        <w:t>postProcessAfterInitialization</w:t>
-      </w:r>
-      <w:proofErr w:type="spellEnd"/>
-      <w:r>
-        <w:t>().</w:t>
+        <w:t>Custom utility method:</w:t>
+      </w:r>
+      <w:r>
+        <w:t> This could be any custom method you have defined in your bean.</w:t>
       </w:r>
     </w:p>
     <w:p>
       <w:pPr>
         <w:numPr>
           <w:ilvl w:val="0"/>
-          <w:numId w:val="25"/>
+          <w:numId w:val="60"/>
         </w:numPr>
       </w:pPr>
       <w:r>
@@ -6989,429 +6948,54 @@
           <w:b/>
           <w:bCs/>
         </w:rPr>
-        <w:t>Bean Ready</w:t>
-      </w:r>
-      <w:r>
-        <w:t xml:space="preserve"> → Used in application.</w:t>
-      </w:r>
-    </w:p>
-    <w:p>
-      <w:pPr>
-        <w:numPr>
-          <w:ilvl w:val="0"/>
-          <w:numId w:val="25"/>
-        </w:numPr>
-      </w:pPr>
-      <w:r>
-        <w:rPr>
-          <w:b/>
-          <w:bCs/>
-        </w:rPr>
-        <w:t>Destruction</w:t>
-      </w:r>
-      <w:r>
-        <w:t xml:space="preserve"> → @PreDestroy, destroy (), destroy-method.</w:t>
-      </w:r>
-    </w:p>
-    <w:p>
-      <w:pPr>
-        <w:ind w:left="720"/>
-      </w:pPr>
+        <w:t xml:space="preserve">Custom </w:t>
+      </w:r>
+      <w:r>
+        <w:rPr>
+          <w:b/>
+          <w:bCs/>
+        </w:rPr>
+        <w:t>destroy (</w:t>
+      </w:r>
+      <w:r>
+        <w:rPr>
+          <w:b/>
+          <w:bCs/>
+        </w:rPr>
+        <w:t>) method:</w:t>
+      </w:r>
+      <w:r>
+        <w:t xml:space="preserve"> If the bean implements </w:t>
+      </w:r>
+      <w:proofErr w:type="spellStart"/>
+      <w:r>
+        <w:t>DisposableBean</w:t>
+      </w:r>
+      <w:proofErr w:type="spellEnd"/>
+      <w:r>
+        <w:t xml:space="preserve"> or has a custom destruction method specified via @PreDestroy or destroy-method, it is called when the container is shutting down.</w:t>
+      </w:r>
     </w:p>
     <w:p>
       <w:pPr>
         <w:ind w:left="360"/>
       </w:pPr>
       <w:r>
-        <w:rPr>
-          <w:rStyle w:val="Strong"/>
-        </w:rPr>
-        <w:t>1. Instantiation (Object Creation)</w:t>
-      </w:r>
-    </w:p>
-    <w:p>
-      <w:pPr>
-        <w:ind w:left="360" w:firstLine="360"/>
-      </w:pPr>
-      <w:r>
-        <w:t>The first step in a bean’s lifecycle is instantiation, where the Spring IoC container creates an object of the bean. This is typically done by calling the bean’s constructor or a static factory method defined in the configuration. At this stage, only the object itself is created, and no dependencies are injected yet</w:t>
-      </w:r>
-    </w:p>
-    <w:p>
-      <w:pPr>
-        <w:ind w:left="360"/>
-        <w:rPr>
-          <w:rStyle w:val="Strong"/>
-        </w:rPr>
-      </w:pPr>
-      <w:r>
-        <w:rPr>
-          <w:rStyle w:val="Strong"/>
-        </w:rPr>
-        <w:t>2. Dependency Injection (Populate Properties)</w:t>
-      </w:r>
-    </w:p>
-    <w:p>
-      <w:pPr>
-        <w:ind w:left="360" w:firstLine="360"/>
-      </w:pPr>
-      <w:r>
-        <w:t>After the bean is created, Spring injects the required dependencies. This process is called Dependency Injection (DI), and it can be performed using constructor injection, setter injection, or field injection. With annotations like @Autowired, Spring automatically wires dependencies into the bean. At this point, the bean becomes fully populated with the resources it needs.</w:t>
-      </w:r>
+        <w:t xml:space="preserve">Resource: </w:t>
+      </w:r>
+      <w:hyperlink r:id="rId19" w:history="1">
+        <w:r>
+          <w:rPr>
+            <w:rStyle w:val="Hyperlink"/>
+          </w:rPr>
+          <w:t>https://www.geeksforgeeks.org/java/bean-life-cycle-in-java-spring/</w:t>
+        </w:r>
+      </w:hyperlink>
     </w:p>
     <w:p>
       <w:pPr>
         <w:ind w:firstLine="360"/>
       </w:pPr>
-      <w:r>
-        <w:rPr>
-          <w:noProof/>
-        </w:rPr>
-        <w:drawing>
-          <wp:inline distT="0" distB="0" distL="0" distR="0" wp14:anchorId="37363957" wp14:editId="2F56DAD7">
-            <wp:extent cx="6645910" cy="1672590"/>
-            <wp:effectExtent l="0" t="0" r="2540" b="3810"/>
-            <wp:docPr id="1701213047" name="Picture 1"/>
-            <wp:cNvGraphicFramePr>
-              <a:graphicFrameLocks xmlns:a="http://schemas.openxmlformats.org/drawingml/2006/main" noChangeAspect="1"/>
-            </wp:cNvGraphicFramePr>
-            <a:graphic xmlns:a="http://schemas.openxmlformats.org/drawingml/2006/main">
-              <a:graphicData uri="http://schemas.openxmlformats.org/drawingml/2006/picture">
-                <pic:pic xmlns:pic="http://schemas.openxmlformats.org/drawingml/2006/picture">
-                  <pic:nvPicPr>
-                    <pic:cNvPr id="1701213047" name=""/>
-                    <pic:cNvPicPr/>
-                  </pic:nvPicPr>
-                  <pic:blipFill>
-                    <a:blip r:embed="rId19"/>
-                    <a:stretch>
-                      <a:fillRect/>
-                    </a:stretch>
-                  </pic:blipFill>
-                  <pic:spPr>
-                    <a:xfrm>
-                      <a:off x="0" y="0"/>
-                      <a:ext cx="6645910" cy="1672590"/>
-                    </a:xfrm>
-                    <a:prstGeom prst="rect">
-                      <a:avLst/>
-                    </a:prstGeom>
-                  </pic:spPr>
-                </pic:pic>
-              </a:graphicData>
-            </a:graphic>
-          </wp:inline>
-        </w:drawing>
-      </w:r>
-    </w:p>
-    <w:p>
-      <w:pPr>
-        <w:ind w:left="360"/>
-        <w:rPr>
-          <w:rStyle w:val="Strong"/>
-        </w:rPr>
-      </w:pPr>
-      <w:r>
-        <w:rPr>
-          <w:rStyle w:val="Strong"/>
-        </w:rPr>
-        <w:t>3. Aware Interfaces (Optional)</w:t>
-      </w:r>
-    </w:p>
-    <w:p>
-      <w:pPr>
-        <w:ind w:left="360" w:firstLine="360"/>
-      </w:pPr>
-      <w:r>
-        <w:t xml:space="preserve">If the bean implements special </w:t>
-      </w:r>
-      <w:r>
-        <w:rPr>
-          <w:i/>
-          <w:iCs/>
-        </w:rPr>
-        <w:t>aware</w:t>
-      </w:r>
-      <w:r>
-        <w:t xml:space="preserve"> interfaces, Spring provides contextual information about the bean. For example, </w:t>
-      </w:r>
-      <w:proofErr w:type="spellStart"/>
-      <w:r>
-        <w:t>BeanNameAware</w:t>
-      </w:r>
-      <w:proofErr w:type="spellEnd"/>
-      <w:r>
-        <w:t xml:space="preserve"> gives the bean its ID defined in the configuration, and </w:t>
-      </w:r>
-      <w:proofErr w:type="spellStart"/>
-      <w:r>
-        <w:t>BeanFactoryAware</w:t>
-      </w:r>
-      <w:proofErr w:type="spellEnd"/>
-      <w:r>
-        <w:t xml:space="preserve"> provides access to the factory that created the bean. This step is optional but allows beans to interact with the Spring container more directly.</w:t>
-      </w:r>
-    </w:p>
-    <w:p>
-      <w:pPr>
-        <w:ind w:firstLine="360"/>
-      </w:pPr>
-      <w:r>
-        <w:rPr>
-          <w:noProof/>
-        </w:rPr>
-        <w:lastRenderedPageBreak/>
-        <w:drawing>
-          <wp:inline distT="0" distB="0" distL="0" distR="0" wp14:anchorId="577188A9" wp14:editId="59DE95F4">
-            <wp:extent cx="6636091" cy="2254366"/>
-            <wp:effectExtent l="0" t="0" r="0" b="0"/>
-            <wp:docPr id="185052798" name="Picture 1" descr="A computer screen shot of a program code&#10;&#10;AI-generated content may be incorrect."/>
-            <wp:cNvGraphicFramePr>
-              <a:graphicFrameLocks xmlns:a="http://schemas.openxmlformats.org/drawingml/2006/main" noChangeAspect="1"/>
-            </wp:cNvGraphicFramePr>
-            <a:graphic xmlns:a="http://schemas.openxmlformats.org/drawingml/2006/main">
-              <a:graphicData uri="http://schemas.openxmlformats.org/drawingml/2006/picture">
-                <pic:pic xmlns:pic="http://schemas.openxmlformats.org/drawingml/2006/picture">
-                  <pic:nvPicPr>
-                    <pic:cNvPr id="185052798" name="Picture 1" descr="A computer screen shot of a program code&#10;&#10;AI-generated content may be incorrect."/>
-                    <pic:cNvPicPr/>
-                  </pic:nvPicPr>
-                  <pic:blipFill>
-                    <a:blip r:embed="rId20"/>
-                    <a:stretch>
-                      <a:fillRect/>
-                    </a:stretch>
-                  </pic:blipFill>
-                  <pic:spPr>
-                    <a:xfrm>
-                      <a:off x="0" y="0"/>
-                      <a:ext cx="6636091" cy="2254366"/>
-                    </a:xfrm>
-                    <a:prstGeom prst="rect">
-                      <a:avLst/>
-                    </a:prstGeom>
-                  </pic:spPr>
-                </pic:pic>
-              </a:graphicData>
-            </a:graphic>
-          </wp:inline>
-        </w:drawing>
-      </w:r>
-    </w:p>
-    <w:p>
-      <w:pPr>
-        <w:ind w:left="360"/>
-        <w:rPr>
-          <w:rStyle w:val="Strong"/>
-        </w:rPr>
-      </w:pPr>
-      <w:r>
-        <w:rPr>
-          <w:rStyle w:val="Strong"/>
-        </w:rPr>
-        <w:t>4. Initialization</w:t>
-      </w:r>
-    </w:p>
-    <w:p>
-      <w:pPr>
-        <w:ind w:left="360" w:firstLine="360"/>
-      </w:pPr>
-      <w:r>
-        <w:t xml:space="preserve">Once the dependencies are injected and the aware interfaces are processed, the bean enters the initialization phase. Here, developers can run custom setup logic. Initialization can be done using @PostConstruct, by implementing the </w:t>
-      </w:r>
-      <w:proofErr w:type="spellStart"/>
-      <w:r>
-        <w:t>InitializingBean</w:t>
-      </w:r>
-      <w:proofErr w:type="spellEnd"/>
-      <w:r>
-        <w:t xml:space="preserve"> interface and overriding </w:t>
-      </w:r>
-      <w:proofErr w:type="spellStart"/>
-      <w:proofErr w:type="gramStart"/>
-      <w:r>
-        <w:t>afterPropertiesSet</w:t>
-      </w:r>
-      <w:proofErr w:type="spellEnd"/>
-      <w:r>
-        <w:t>(</w:t>
-      </w:r>
-      <w:proofErr w:type="gramEnd"/>
-      <w:r>
-        <w:t xml:space="preserve">), or by specifying an </w:t>
-      </w:r>
-      <w:proofErr w:type="spellStart"/>
-      <w:r>
-        <w:t>init</w:t>
-      </w:r>
-      <w:proofErr w:type="spellEnd"/>
-      <w:r>
-        <w:t>-method in the configuration. This phase is often used to open database connections, allocate resources, or load initial data.</w:t>
-      </w:r>
-    </w:p>
-    <w:p>
-      <w:pPr>
-        <w:ind w:firstLine="360"/>
-      </w:pPr>
-      <w:r>
-        <w:rPr>
-          <w:noProof/>
-        </w:rPr>
-        <w:drawing>
-          <wp:inline distT="0" distB="0" distL="0" distR="0" wp14:anchorId="79F8C543" wp14:editId="26277348">
-            <wp:extent cx="6645910" cy="3117215"/>
-            <wp:effectExtent l="0" t="0" r="2540" b="6985"/>
-            <wp:docPr id="44702755" name="Picture 1" descr="A computer screen with text on it&#10;&#10;AI-generated content may be incorrect."/>
-            <wp:cNvGraphicFramePr>
-              <a:graphicFrameLocks xmlns:a="http://schemas.openxmlformats.org/drawingml/2006/main" noChangeAspect="1"/>
-            </wp:cNvGraphicFramePr>
-            <a:graphic xmlns:a="http://schemas.openxmlformats.org/drawingml/2006/main">
-              <a:graphicData uri="http://schemas.openxmlformats.org/drawingml/2006/picture">
-                <pic:pic xmlns:pic="http://schemas.openxmlformats.org/drawingml/2006/picture">
-                  <pic:nvPicPr>
-                    <pic:cNvPr id="44702755" name="Picture 1" descr="A computer screen with text on it&#10;&#10;AI-generated content may be incorrect."/>
-                    <pic:cNvPicPr/>
-                  </pic:nvPicPr>
-                  <pic:blipFill>
-                    <a:blip r:embed="rId21"/>
-                    <a:stretch>
-                      <a:fillRect/>
-                    </a:stretch>
-                  </pic:blipFill>
-                  <pic:spPr>
-                    <a:xfrm>
-                      <a:off x="0" y="0"/>
-                      <a:ext cx="6645910" cy="3117215"/>
-                    </a:xfrm>
-                    <a:prstGeom prst="rect">
-                      <a:avLst/>
-                    </a:prstGeom>
-                  </pic:spPr>
-                </pic:pic>
-              </a:graphicData>
-            </a:graphic>
-          </wp:inline>
-        </w:drawing>
-      </w:r>
-    </w:p>
-    <w:p>
-      <w:pPr>
-        <w:ind w:left="360" w:firstLine="360"/>
-      </w:pPr>
-    </w:p>
-    <w:p>
-      <w:pPr>
-        <w:ind w:left="360"/>
-        <w:rPr>
-          <w:rStyle w:val="Strong"/>
-        </w:rPr>
-      </w:pPr>
-      <w:r>
-        <w:rPr>
-          <w:rStyle w:val="Strong"/>
-        </w:rPr>
-        <w:t>5. Post-Initialization (Bean Ready for Use)</w:t>
-      </w:r>
-    </w:p>
-    <w:p>
-      <w:pPr>
-        <w:ind w:left="360" w:firstLine="360"/>
-      </w:pPr>
-      <w:r>
-        <w:t xml:space="preserve">After initialization, the bean is given a final opportunity to be customized using </w:t>
-      </w:r>
-      <w:proofErr w:type="spellStart"/>
-      <w:r>
-        <w:t>BeanPostProcessor</w:t>
-      </w:r>
-      <w:proofErr w:type="spellEnd"/>
-      <w:r>
-        <w:t>. This is where proxy objects can be wrapped around beans, or cross-cutting concerns such as logging and security can be applied. Once post-initialization is complete, the bean is fully ready for use and can serve application requests.</w:t>
-      </w:r>
-    </w:p>
-    <w:p>
-      <w:pPr>
-        <w:ind w:left="360"/>
-        <w:rPr>
-          <w:rStyle w:val="Strong"/>
-        </w:rPr>
-      </w:pPr>
-      <w:r>
-        <w:rPr>
-          <w:rStyle w:val="Strong"/>
-        </w:rPr>
-        <w:t>6. Destruction (Cleanup Phase)</w:t>
-      </w:r>
-    </w:p>
-    <w:p>
-      <w:pPr>
-        <w:ind w:left="360" w:firstLine="360"/>
-      </w:pPr>
-      <w:r>
-        <w:t xml:space="preserve">When the Spring container shuts down or the bean’s scope ends, the bean is destroyed. During this phase, Spring calls the destruction callbacks defined by the developer. This can be done using @PreDestroy, by implementing the </w:t>
-      </w:r>
-      <w:proofErr w:type="spellStart"/>
-      <w:r>
-        <w:t>DisposableBean</w:t>
-      </w:r>
-      <w:proofErr w:type="spellEnd"/>
-      <w:r>
-        <w:t xml:space="preserve"> interface and overriding the </w:t>
-      </w:r>
-      <w:proofErr w:type="gramStart"/>
-      <w:r>
-        <w:t>destroy(</w:t>
-      </w:r>
-      <w:proofErr w:type="gramEnd"/>
-      <w:r>
-        <w:t>) method, or by specifying a destroy-method in the configuration. This phase is used to release resources such as closing database connections, stopping background threads, or clearing caches.</w:t>
-      </w:r>
-    </w:p>
-    <w:p>
-      <w:pPr>
-        <w:ind w:firstLine="360"/>
-      </w:pPr>
-      <w:r>
-        <w:rPr>
-          <w:noProof/>
-        </w:rPr>
-        <w:lastRenderedPageBreak/>
-        <w:drawing>
-          <wp:inline distT="0" distB="0" distL="0" distR="0" wp14:anchorId="358305D8" wp14:editId="0F719CAF">
-            <wp:extent cx="6645910" cy="3113405"/>
-            <wp:effectExtent l="0" t="0" r="2540" b="0"/>
-            <wp:docPr id="306314657" name="Picture 1" descr="A screenshot of a computer program&#10;&#10;AI-generated content may be incorrect."/>
-            <wp:cNvGraphicFramePr>
-              <a:graphicFrameLocks xmlns:a="http://schemas.openxmlformats.org/drawingml/2006/main" noChangeAspect="1"/>
-            </wp:cNvGraphicFramePr>
-            <a:graphic xmlns:a="http://schemas.openxmlformats.org/drawingml/2006/main">
-              <a:graphicData uri="http://schemas.openxmlformats.org/drawingml/2006/picture">
-                <pic:pic xmlns:pic="http://schemas.openxmlformats.org/drawingml/2006/picture">
-                  <pic:nvPicPr>
-                    <pic:cNvPr id="306314657" name="Picture 1" descr="A screenshot of a computer program&#10;&#10;AI-generated content may be incorrect."/>
-                    <pic:cNvPicPr/>
-                  </pic:nvPicPr>
-                  <pic:blipFill>
-                    <a:blip r:embed="rId22"/>
-                    <a:stretch>
-                      <a:fillRect/>
-                    </a:stretch>
-                  </pic:blipFill>
-                  <pic:spPr>
-                    <a:xfrm>
-                      <a:off x="0" y="0"/>
-                      <a:ext cx="6645910" cy="3113405"/>
-                    </a:xfrm>
-                    <a:prstGeom prst="rect">
-                      <a:avLst/>
-                    </a:prstGeom>
-                  </pic:spPr>
-                </pic:pic>
-              </a:graphicData>
-            </a:graphic>
-          </wp:inline>
-        </w:drawing>
-      </w:r>
     </w:p>
     <w:p>
       <w:pPr>
@@ -7424,7 +7008,7 @@
           <w:bdr w:val="none" w:sz="0" w:space="0" w:color="auto" w:frame="1"/>
         </w:rPr>
       </w:pPr>
-      <w:bookmarkStart w:id="9" w:name="_Toc210285746"/>
+      <w:bookmarkStart w:id="9" w:name="_Toc211865449"/>
       <w:r>
         <w:rPr>
           <w:bdr w:val="none" w:sz="0" w:space="0" w:color="auto" w:frame="1"/>
@@ -7467,7 +7051,7 @@
                     </pic:cNvPicPr>
                   </pic:nvPicPr>
                   <pic:blipFill>
-                    <a:blip r:embed="rId23">
+                    <a:blip r:embed="rId20">
                       <a:extLst>
                         <a:ext uri="{28A0092B-C50C-407E-A947-70E740481C1C}">
                           <a14:useLocalDpi xmlns:a14="http://schemas.microsoft.com/office/drawing/2010/main" val="0"/>
@@ -7513,7 +7097,7 @@
           <w:bdr w:val="none" w:sz="0" w:space="0" w:color="auto" w:frame="1"/>
         </w:rPr>
       </w:pPr>
-      <w:bookmarkStart w:id="10" w:name="_Toc210285747"/>
+      <w:bookmarkStart w:id="10" w:name="_Toc211865450"/>
       <w:r>
         <w:rPr>
           <w:bdr w:val="none" w:sz="0" w:space="0" w:color="auto" w:frame="1"/>
@@ -7917,7 +7501,7 @@
       <w:r>
         <w:t xml:space="preserve">Resources: </w:t>
       </w:r>
-      <w:hyperlink r:id="rId24" w:history="1">
+      <w:hyperlink r:id="rId21" w:history="1">
         <w:r>
           <w:rPr>
             <w:rStyle w:val="Hyperlink"/>
@@ -7937,7 +7521,7 @@
           <w:bdr w:val="none" w:sz="0" w:space="0" w:color="auto" w:frame="1"/>
         </w:rPr>
       </w:pPr>
-      <w:bookmarkStart w:id="11" w:name="_Toc210285748"/>
+      <w:bookmarkStart w:id="11" w:name="_Toc211865451"/>
       <w:r>
         <w:rPr>
           <w:bdr w:val="none" w:sz="0" w:space="0" w:color="auto" w:frame="1"/>
@@ -7982,7 +7566,7 @@
       <w:r>
         <w:t xml:space="preserve">Resources: </w:t>
       </w:r>
-      <w:hyperlink r:id="rId25" w:history="1">
+      <w:hyperlink r:id="rId22" w:history="1">
         <w:r>
           <w:rPr>
             <w:rStyle w:val="Hyperlink"/>
@@ -8002,7 +7586,7 @@
           <w:bdr w:val="none" w:sz="0" w:space="0" w:color="auto" w:frame="1"/>
         </w:rPr>
       </w:pPr>
-      <w:bookmarkStart w:id="12" w:name="_Toc210285749"/>
+      <w:bookmarkStart w:id="12" w:name="_Toc211865452"/>
       <w:r>
         <w:rPr>
           <w:bdr w:val="none" w:sz="0" w:space="0" w:color="auto" w:frame="1"/>
@@ -8021,7 +7605,7 @@
       <w:r>
         <w:t xml:space="preserve">Resource: </w:t>
       </w:r>
-      <w:hyperlink r:id="rId26" w:history="1">
+      <w:hyperlink r:id="rId23" w:history="1">
         <w:r>
           <w:rPr>
             <w:rStyle w:val="Hyperlink"/>
@@ -8042,7 +7626,7 @@
         </w:rPr>
       </w:pPr>
       <w:bookmarkStart w:id="13" w:name="_Toc206877775"/>
-      <w:bookmarkStart w:id="14" w:name="_Toc210285750"/>
+      <w:bookmarkStart w:id="14" w:name="_Toc211865453"/>
       <w:r>
         <w:rPr>
           <w:bdr w:val="none" w:sz="0" w:space="0" w:color="auto" w:frame="1"/>
@@ -8072,7 +7656,7 @@
         </w:rPr>
       </w:pPr>
       <w:bookmarkStart w:id="15" w:name="_Toc206877777"/>
-      <w:bookmarkStart w:id="16" w:name="_Toc210285751"/>
+      <w:bookmarkStart w:id="16" w:name="_Toc211865454"/>
       <w:r>
         <w:rPr>
           <w:bdr w:val="none" w:sz="0" w:space="0" w:color="auto" w:frame="1"/>
@@ -8785,7 +8369,7 @@
       <w:pPr>
         <w:pStyle w:val="Heading2"/>
       </w:pPr>
-      <w:bookmarkStart w:id="17" w:name="_Toc210285752"/>
+      <w:bookmarkStart w:id="17" w:name="_Toc211865455"/>
       <w:r>
         <w:lastRenderedPageBreak/>
         <w:t>Spring Boot</w:t>
@@ -8806,7 +8390,7 @@
           <w:bdr w:val="none" w:sz="0" w:space="0" w:color="auto" w:frame="1"/>
         </w:rPr>
       </w:pPr>
-      <w:bookmarkStart w:id="18" w:name="_Toc210285753"/>
+      <w:bookmarkStart w:id="18" w:name="_Toc211865456"/>
       <w:r>
         <w:rPr>
           <w:bdr w:val="none" w:sz="0" w:space="0" w:color="auto" w:frame="1"/>
@@ -8883,7 +8467,7 @@
           <w:bdr w:val="none" w:sz="0" w:space="0" w:color="auto" w:frame="1"/>
         </w:rPr>
       </w:pPr>
-      <w:bookmarkStart w:id="19" w:name="_Toc210285754"/>
+      <w:bookmarkStart w:id="19" w:name="_Toc211865457"/>
       <w:r>
         <w:rPr>
           <w:bdr w:val="none" w:sz="0" w:space="0" w:color="auto" w:frame="1"/>
@@ -9245,7 +8829,7 @@
           <w:bdr w:val="none" w:sz="0" w:space="0" w:color="auto" w:frame="1"/>
         </w:rPr>
       </w:pPr>
-      <w:bookmarkStart w:id="20" w:name="_Toc210285755"/>
+      <w:bookmarkStart w:id="20" w:name="_Toc211865458"/>
       <w:r>
         <w:rPr>
           <w:bdr w:val="none" w:sz="0" w:space="0" w:color="auto" w:frame="1"/>
@@ -9629,7 +9213,7 @@
           <w:bdr w:val="none" w:sz="0" w:space="0" w:color="auto" w:frame="1"/>
         </w:rPr>
       </w:pPr>
-      <w:bookmarkStart w:id="21" w:name="_Toc210285756"/>
+      <w:bookmarkStart w:id="21" w:name="_Toc211865459"/>
       <w:r>
         <w:rPr>
           <w:bdr w:val="none" w:sz="0" w:space="0" w:color="auto" w:frame="1"/>
@@ -9651,7 +9235,7 @@
       <w:r>
         <w:t xml:space="preserve">Resources: </w:t>
       </w:r>
-      <w:hyperlink r:id="rId27" w:history="1">
+      <w:hyperlink r:id="rId24" w:history="1">
         <w:r>
           <w:rPr>
             <w:rStyle w:val="Hyperlink"/>
@@ -9677,7 +9261,7 @@
         </w:rPr>
       </w:pPr>
       <w:bookmarkStart w:id="22" w:name="_Toc206877784"/>
-      <w:bookmarkStart w:id="23" w:name="_Toc210285757"/>
+      <w:bookmarkStart w:id="23" w:name="_Toc211865460"/>
       <w:r>
         <w:rPr>
           <w:bdr w:val="none" w:sz="0" w:space="0" w:color="auto" w:frame="1"/>
@@ -9715,7 +9299,7 @@
         </w:rPr>
       </w:pPr>
       <w:bookmarkStart w:id="24" w:name="_Toc206877789"/>
-      <w:bookmarkStart w:id="25" w:name="_Toc210285758"/>
+      <w:bookmarkStart w:id="25" w:name="_Toc211865461"/>
       <w:r>
         <w:rPr>
           <w:bdr w:val="none" w:sz="0" w:space="0" w:color="auto" w:frame="1"/>
@@ -9793,7 +9377,7 @@
         </w:numPr>
       </w:pPr>
       <w:bookmarkStart w:id="26" w:name="_Toc206877790"/>
-      <w:bookmarkStart w:id="27" w:name="_Toc210285759"/>
+      <w:bookmarkStart w:id="27" w:name="_Toc211865462"/>
       <w:r>
         <w:t xml:space="preserve">What is </w:t>
       </w:r>
@@ -9974,7 +9558,7 @@
         </w:numPr>
       </w:pPr>
       <w:bookmarkStart w:id="28" w:name="_Toc206877791"/>
-      <w:bookmarkStart w:id="29" w:name="_Toc210285760"/>
+      <w:bookmarkStart w:id="29" w:name="_Toc211865463"/>
       <w:r>
         <w:t xml:space="preserve">What is </w:t>
       </w:r>
@@ -10095,7 +9679,7 @@
       <w:r>
         <w:t xml:space="preserve">POST  </w:t>
       </w:r>
-      <w:hyperlink r:id="rId28" w:history="1">
+      <w:hyperlink r:id="rId25" w:history="1">
         <w:r>
           <w:rPr>
             <w:rStyle w:val="Hyperlink"/>
@@ -10119,7 +9703,7 @@
       <w:r>
         <w:t xml:space="preserve">POST  </w:t>
       </w:r>
-      <w:hyperlink r:id="rId29" w:history="1">
+      <w:hyperlink r:id="rId26" w:history="1">
         <w:r>
           <w:rPr>
             <w:rStyle w:val="Hyperlink"/>
@@ -10214,7 +9798,7 @@
       <w:pPr>
         <w:pStyle w:val="ListParagraph"/>
       </w:pPr>
-      <w:hyperlink r:id="rId30" w:history="1">
+      <w:hyperlink r:id="rId27" w:history="1">
         <w:r>
           <w:rPr>
             <w:rStyle w:val="Hyperlink"/>
@@ -10235,7 +9819,7 @@
       <w:pPr>
         <w:pStyle w:val="ListParagraph"/>
       </w:pPr>
-      <w:hyperlink r:id="rId31" w:history="1">
+      <w:hyperlink r:id="rId28" w:history="1">
         <w:r>
           <w:rPr>
             <w:rStyle w:val="Hyperlink"/>
@@ -10336,7 +9920,7 @@
       <w:pPr>
         <w:pStyle w:val="ListParagraph"/>
       </w:pPr>
-      <w:hyperlink r:id="rId32" w:history="1">
+      <w:hyperlink r:id="rId29" w:history="1">
         <w:r>
           <w:rPr>
             <w:rStyle w:val="Hyperlink"/>
@@ -10424,7 +10008,7 @@
       <w:r>
         <w:t xml:space="preserve">GET </w:t>
       </w:r>
-      <w:hyperlink r:id="rId33" w:history="1">
+      <w:hyperlink r:id="rId30" w:history="1">
         <w:r>
           <w:rPr>
             <w:rStyle w:val="Hyperlink"/>
@@ -10543,7 +10127,7 @@
         </w:numPr>
       </w:pPr>
       <w:bookmarkStart w:id="30" w:name="_Toc206877792"/>
-      <w:bookmarkStart w:id="31" w:name="_Toc210285761"/>
+      <w:bookmarkStart w:id="31" w:name="_Toc211865464"/>
       <w:r>
         <w:lastRenderedPageBreak/>
         <w:t xml:space="preserve">Diff between rest and soap </w:t>
@@ -10580,7 +10164,7 @@
                     </pic:cNvPicPr>
                   </pic:nvPicPr>
                   <pic:blipFill>
-                    <a:blip r:embed="rId34">
+                    <a:blip r:embed="rId31">
                       <a:extLst>
                         <a:ext uri="{28A0092B-C50C-407E-A947-70E740481C1C}">
                           <a14:useLocalDpi xmlns:a14="http://schemas.microsoft.com/office/drawing/2010/main" val="0"/>
@@ -10622,7 +10206,7 @@
         </w:numPr>
       </w:pPr>
       <w:bookmarkStart w:id="32" w:name="_Toc206877793"/>
-      <w:bookmarkStart w:id="33" w:name="_Toc210285762"/>
+      <w:bookmarkStart w:id="33" w:name="_Toc211865465"/>
       <w:r>
         <w:t>What is path variable and request parameters?</w:t>
       </w:r>
@@ -11066,7 +10650,7 @@
         </w:numPr>
       </w:pPr>
       <w:bookmarkStart w:id="34" w:name="_Toc206877794"/>
-      <w:bookmarkStart w:id="35" w:name="_Toc210285763"/>
+      <w:bookmarkStart w:id="35" w:name="_Toc211865466"/>
       <w:r>
         <w:t>What does @Value and @ConfigurationProperties annotation do?</w:t>
       </w:r>
@@ -11183,7 +10767,7 @@
                     <pic:cNvPicPr/>
                   </pic:nvPicPr>
                   <pic:blipFill>
-                    <a:blip r:embed="rId35"/>
+                    <a:blip r:embed="rId32"/>
                     <a:stretch>
                       <a:fillRect/>
                     </a:stretch>
@@ -11301,7 +10885,7 @@
                     <pic:cNvPicPr/>
                   </pic:nvPicPr>
                   <pic:blipFill>
-                    <a:blip r:embed="rId36"/>
+                    <a:blip r:embed="rId33"/>
                     <a:stretch>
                       <a:fillRect/>
                     </a:stretch>
@@ -11333,7 +10917,7 @@
         </w:numPr>
       </w:pPr>
       <w:bookmarkStart w:id="36" w:name="_Toc206877795"/>
-      <w:bookmarkStart w:id="37" w:name="_Toc210285764"/>
+      <w:bookmarkStart w:id="37" w:name="_Toc211865467"/>
       <w:r>
         <w:t xml:space="preserve">How to handle the exception in rest </w:t>
       </w:r>
@@ -11599,7 +11183,7 @@
         </w:numPr>
       </w:pPr>
       <w:bookmarkStart w:id="38" w:name="_Toc206877796"/>
-      <w:bookmarkStart w:id="39" w:name="_Toc210285765"/>
+      <w:bookmarkStart w:id="39" w:name="_Toc211865468"/>
       <w:r>
         <w:t>Tell me the name of some starter dependency in spring boot?</w:t>
       </w:r>
@@ -11770,7 +11354,7 @@
         </w:numPr>
       </w:pPr>
       <w:bookmarkStart w:id="40" w:name="_Toc206877797"/>
-      <w:bookmarkStart w:id="41" w:name="_Toc210285766"/>
+      <w:bookmarkStart w:id="41" w:name="_Toc211865469"/>
       <w:r>
         <w:t xml:space="preserve">What is mean by path and </w:t>
       </w:r>
@@ -12055,7 +11639,7 @@
         </w:numPr>
       </w:pPr>
       <w:bookmarkStart w:id="42" w:name="_Toc206877798"/>
-      <w:bookmarkStart w:id="43" w:name="_Toc210285767"/>
+      <w:bookmarkStart w:id="43" w:name="_Toc211865470"/>
       <w:r>
         <w:t>What is mean by API and REST API?</w:t>
       </w:r>
@@ -12217,7 +11801,7 @@
       <w:r>
         <w:t xml:space="preserve">Resource: </w:t>
       </w:r>
-      <w:hyperlink r:id="rId37" w:history="1">
+      <w:hyperlink r:id="rId34" w:history="1">
         <w:r>
           <w:rPr>
             <w:rStyle w:val="Hyperlink"/>
@@ -12270,7 +11854,7 @@
       <w:pPr>
         <w:pStyle w:val="Heading2"/>
       </w:pPr>
-      <w:bookmarkStart w:id="45" w:name="_Toc210285768"/>
+      <w:bookmarkStart w:id="45" w:name="_Toc211865471"/>
       <w:r>
         <w:t>Spring Security</w:t>
       </w:r>
@@ -12284,7 +11868,7 @@
           <w:numId w:val="53"/>
         </w:numPr>
       </w:pPr>
-      <w:bookmarkStart w:id="46" w:name="_Toc210285769"/>
+      <w:bookmarkStart w:id="46" w:name="_Toc211865472"/>
       <w:r>
         <w:t xml:space="preserve">How do </w:t>
       </w:r>
@@ -15388,6 +14972,155 @@
     </w:lvl>
   </w:abstractNum>
   <w:abstractNum w:abstractNumId="22" w15:restartNumberingAfterBreak="0">
+    <w:nsid w:val="2BE53DFD"/>
+    <w:multiLevelType w:val="multilevel"/>
+    <w:tmpl w:val="A7503EF4"/>
+    <w:lvl w:ilvl="0">
+      <w:start w:val="1"/>
+      <w:numFmt w:val="bullet"/>
+      <w:lvlText w:val=""/>
+      <w:lvlJc w:val="left"/>
+      <w:pPr>
+        <w:tabs>
+          <w:tab w:val="num" w:pos="720"/>
+        </w:tabs>
+        <w:ind w:left="720" w:hanging="360"/>
+      </w:pPr>
+      <w:rPr>
+        <w:rFonts w:ascii="Symbol" w:hAnsi="Symbol" w:hint="default"/>
+        <w:sz w:val="20"/>
+      </w:rPr>
+    </w:lvl>
+    <w:lvl w:ilvl="1" w:tentative="1">
+      <w:start w:val="1"/>
+      <w:numFmt w:val="bullet"/>
+      <w:lvlText w:val=""/>
+      <w:lvlJc w:val="left"/>
+      <w:pPr>
+        <w:tabs>
+          <w:tab w:val="num" w:pos="1440"/>
+        </w:tabs>
+        <w:ind w:left="1440" w:hanging="360"/>
+      </w:pPr>
+      <w:rPr>
+        <w:rFonts w:ascii="Symbol" w:hAnsi="Symbol" w:hint="default"/>
+        <w:sz w:val="20"/>
+      </w:rPr>
+    </w:lvl>
+    <w:lvl w:ilvl="2" w:tentative="1">
+      <w:start w:val="1"/>
+      <w:numFmt w:val="bullet"/>
+      <w:lvlText w:val=""/>
+      <w:lvlJc w:val="left"/>
+      <w:pPr>
+        <w:tabs>
+          <w:tab w:val="num" w:pos="2160"/>
+        </w:tabs>
+        <w:ind w:left="2160" w:hanging="360"/>
+      </w:pPr>
+      <w:rPr>
+        <w:rFonts w:ascii="Symbol" w:hAnsi="Symbol" w:hint="default"/>
+        <w:sz w:val="20"/>
+      </w:rPr>
+    </w:lvl>
+    <w:lvl w:ilvl="3" w:tentative="1">
+      <w:start w:val="1"/>
+      <w:numFmt w:val="bullet"/>
+      <w:lvlText w:val=""/>
+      <w:lvlJc w:val="left"/>
+      <w:pPr>
+        <w:tabs>
+          <w:tab w:val="num" w:pos="2880"/>
+        </w:tabs>
+        <w:ind w:left="2880" w:hanging="360"/>
+      </w:pPr>
+      <w:rPr>
+        <w:rFonts w:ascii="Symbol" w:hAnsi="Symbol" w:hint="default"/>
+        <w:sz w:val="20"/>
+      </w:rPr>
+    </w:lvl>
+    <w:lvl w:ilvl="4" w:tentative="1">
+      <w:start w:val="1"/>
+      <w:numFmt w:val="bullet"/>
+      <w:lvlText w:val=""/>
+      <w:lvlJc w:val="left"/>
+      <w:pPr>
+        <w:tabs>
+          <w:tab w:val="num" w:pos="3600"/>
+        </w:tabs>
+        <w:ind w:left="3600" w:hanging="360"/>
+      </w:pPr>
+      <w:rPr>
+        <w:rFonts w:ascii="Symbol" w:hAnsi="Symbol" w:hint="default"/>
+        <w:sz w:val="20"/>
+      </w:rPr>
+    </w:lvl>
+    <w:lvl w:ilvl="5" w:tentative="1">
+      <w:start w:val="1"/>
+      <w:numFmt w:val="bullet"/>
+      <w:lvlText w:val=""/>
+      <w:lvlJc w:val="left"/>
+      <w:pPr>
+        <w:tabs>
+          <w:tab w:val="num" w:pos="4320"/>
+        </w:tabs>
+        <w:ind w:left="4320" w:hanging="360"/>
+      </w:pPr>
+      <w:rPr>
+        <w:rFonts w:ascii="Symbol" w:hAnsi="Symbol" w:hint="default"/>
+        <w:sz w:val="20"/>
+      </w:rPr>
+    </w:lvl>
+    <w:lvl w:ilvl="6" w:tentative="1">
+      <w:start w:val="1"/>
+      <w:numFmt w:val="bullet"/>
+      <w:lvlText w:val=""/>
+      <w:lvlJc w:val="left"/>
+      <w:pPr>
+        <w:tabs>
+          <w:tab w:val="num" w:pos="5040"/>
+        </w:tabs>
+        <w:ind w:left="5040" w:hanging="360"/>
+      </w:pPr>
+      <w:rPr>
+        <w:rFonts w:ascii="Symbol" w:hAnsi="Symbol" w:hint="default"/>
+        <w:sz w:val="20"/>
+      </w:rPr>
+    </w:lvl>
+    <w:lvl w:ilvl="7" w:tentative="1">
+      <w:start w:val="1"/>
+      <w:numFmt w:val="bullet"/>
+      <w:lvlText w:val=""/>
+      <w:lvlJc w:val="left"/>
+      <w:pPr>
+        <w:tabs>
+          <w:tab w:val="num" w:pos="5760"/>
+        </w:tabs>
+        <w:ind w:left="5760" w:hanging="360"/>
+      </w:pPr>
+      <w:rPr>
+        <w:rFonts w:ascii="Symbol" w:hAnsi="Symbol" w:hint="default"/>
+        <w:sz w:val="20"/>
+      </w:rPr>
+    </w:lvl>
+    <w:lvl w:ilvl="8" w:tentative="1">
+      <w:start w:val="1"/>
+      <w:numFmt w:val="bullet"/>
+      <w:lvlText w:val=""/>
+      <w:lvlJc w:val="left"/>
+      <w:pPr>
+        <w:tabs>
+          <w:tab w:val="num" w:pos="6480"/>
+        </w:tabs>
+        <w:ind w:left="6480" w:hanging="360"/>
+      </w:pPr>
+      <w:rPr>
+        <w:rFonts w:ascii="Symbol" w:hAnsi="Symbol" w:hint="default"/>
+        <w:sz w:val="20"/>
+      </w:rPr>
+    </w:lvl>
+  </w:abstractNum>
+  <w:abstractNum w:abstractNumId="23" w15:restartNumberingAfterBreak="0">
     <w:nsid w:val="2E411F6D"/>
     <w:multiLevelType w:val="multilevel"/>
     <w:tmpl w:val="A634A198"/>
@@ -15536,7 +15269,7 @@
       </w:rPr>
     </w:lvl>
   </w:abstractNum>
-  <w:abstractNum w:abstractNumId="23" w15:restartNumberingAfterBreak="0">
+  <w:abstractNum w:abstractNumId="24" w15:restartNumberingAfterBreak="0">
     <w:nsid w:val="2EB8008F"/>
     <w:multiLevelType w:val="multilevel"/>
     <w:tmpl w:val="17F451B6"/>
@@ -15685,7 +15418,7 @@
       </w:rPr>
     </w:lvl>
   </w:abstractNum>
-  <w:abstractNum w:abstractNumId="24" w15:restartNumberingAfterBreak="0">
+  <w:abstractNum w:abstractNumId="25" w15:restartNumberingAfterBreak="0">
     <w:nsid w:val="301F4580"/>
     <w:multiLevelType w:val="multilevel"/>
     <w:tmpl w:val="E22665B4"/>
@@ -15834,7 +15567,7 @@
       </w:rPr>
     </w:lvl>
   </w:abstractNum>
-  <w:abstractNum w:abstractNumId="25" w15:restartNumberingAfterBreak="0">
+  <w:abstractNum w:abstractNumId="26" w15:restartNumberingAfterBreak="0">
     <w:nsid w:val="33A162AC"/>
     <w:multiLevelType w:val="hybridMultilevel"/>
     <w:tmpl w:val="3AE49D18"/>
@@ -15923,7 +15656,7 @@
       </w:pPr>
     </w:lvl>
   </w:abstractNum>
-  <w:abstractNum w:abstractNumId="26" w15:restartNumberingAfterBreak="0">
+  <w:abstractNum w:abstractNumId="27" w15:restartNumberingAfterBreak="0">
     <w:nsid w:val="3A84254B"/>
     <w:multiLevelType w:val="multilevel"/>
     <w:tmpl w:val="D3A0258A"/>
@@ -16072,7 +15805,7 @@
       </w:rPr>
     </w:lvl>
   </w:abstractNum>
-  <w:abstractNum w:abstractNumId="27" w15:restartNumberingAfterBreak="0">
+  <w:abstractNum w:abstractNumId="28" w15:restartNumberingAfterBreak="0">
     <w:nsid w:val="3BA03386"/>
     <w:multiLevelType w:val="hybridMultilevel"/>
     <w:tmpl w:val="3AE49D18"/>
@@ -16161,7 +15894,7 @@
       </w:pPr>
     </w:lvl>
   </w:abstractNum>
-  <w:abstractNum w:abstractNumId="28" w15:restartNumberingAfterBreak="0">
+  <w:abstractNum w:abstractNumId="29" w15:restartNumberingAfterBreak="0">
     <w:nsid w:val="3BFD0EE3"/>
     <w:multiLevelType w:val="multilevel"/>
     <w:tmpl w:val="A2460714"/>
@@ -16310,7 +16043,7 @@
       </w:rPr>
     </w:lvl>
   </w:abstractNum>
-  <w:abstractNum w:abstractNumId="29" w15:restartNumberingAfterBreak="0">
+  <w:abstractNum w:abstractNumId="30" w15:restartNumberingAfterBreak="0">
     <w:nsid w:val="3E311408"/>
     <w:multiLevelType w:val="hybridMultilevel"/>
     <w:tmpl w:val="3874386C"/>
@@ -16423,7 +16156,7 @@
       </w:rPr>
     </w:lvl>
   </w:abstractNum>
-  <w:abstractNum w:abstractNumId="30" w15:restartNumberingAfterBreak="0">
+  <w:abstractNum w:abstractNumId="31" w15:restartNumberingAfterBreak="0">
     <w:nsid w:val="424F0289"/>
     <w:multiLevelType w:val="hybridMultilevel"/>
     <w:tmpl w:val="2AFED09A"/>
@@ -16513,7 +16246,7 @@
       </w:pPr>
     </w:lvl>
   </w:abstractNum>
-  <w:abstractNum w:abstractNumId="31" w15:restartNumberingAfterBreak="0">
+  <w:abstractNum w:abstractNumId="32" w15:restartNumberingAfterBreak="0">
     <w:nsid w:val="48442093"/>
     <w:multiLevelType w:val="multilevel"/>
     <w:tmpl w:val="D688D5B6"/>
@@ -16662,7 +16395,7 @@
       </w:rPr>
     </w:lvl>
   </w:abstractNum>
-  <w:abstractNum w:abstractNumId="32" w15:restartNumberingAfterBreak="0">
+  <w:abstractNum w:abstractNumId="33" w15:restartNumberingAfterBreak="0">
     <w:nsid w:val="4BA70D25"/>
     <w:multiLevelType w:val="hybridMultilevel"/>
     <w:tmpl w:val="EB70BD26"/>
@@ -16748,7 +16481,7 @@
       </w:pPr>
     </w:lvl>
   </w:abstractNum>
-  <w:abstractNum w:abstractNumId="33" w15:restartNumberingAfterBreak="0">
+  <w:abstractNum w:abstractNumId="34" w15:restartNumberingAfterBreak="0">
     <w:nsid w:val="52D6357C"/>
     <w:multiLevelType w:val="multilevel"/>
     <w:tmpl w:val="3C588EF8"/>
@@ -16897,7 +16630,7 @@
       </w:rPr>
     </w:lvl>
   </w:abstractNum>
-  <w:abstractNum w:abstractNumId="34" w15:restartNumberingAfterBreak="0">
+  <w:abstractNum w:abstractNumId="35" w15:restartNumberingAfterBreak="0">
     <w:nsid w:val="58433E48"/>
     <w:multiLevelType w:val="multilevel"/>
     <w:tmpl w:val="286AE4B2"/>
@@ -17010,7 +16743,7 @@
       </w:pPr>
     </w:lvl>
   </w:abstractNum>
-  <w:abstractNum w:abstractNumId="35" w15:restartNumberingAfterBreak="0">
+  <w:abstractNum w:abstractNumId="36" w15:restartNumberingAfterBreak="0">
     <w:nsid w:val="5849249C"/>
     <w:multiLevelType w:val="multilevel"/>
     <w:tmpl w:val="6E2620F4"/>
@@ -17159,7 +16892,7 @@
       </w:rPr>
     </w:lvl>
   </w:abstractNum>
-  <w:abstractNum w:abstractNumId="36" w15:restartNumberingAfterBreak="0">
+  <w:abstractNum w:abstractNumId="37" w15:restartNumberingAfterBreak="0">
     <w:nsid w:val="66C85AD1"/>
     <w:multiLevelType w:val="hybridMultilevel"/>
     <w:tmpl w:val="630E6ABE"/>
@@ -17245,7 +16978,7 @@
       </w:pPr>
     </w:lvl>
   </w:abstractNum>
-  <w:abstractNum w:abstractNumId="37" w15:restartNumberingAfterBreak="0">
+  <w:abstractNum w:abstractNumId="38" w15:restartNumberingAfterBreak="0">
     <w:nsid w:val="676F5D74"/>
     <w:multiLevelType w:val="hybridMultilevel"/>
     <w:tmpl w:val="09566636"/>
@@ -17334,7 +17067,7 @@
       </w:pPr>
     </w:lvl>
   </w:abstractNum>
-  <w:abstractNum w:abstractNumId="38" w15:restartNumberingAfterBreak="0">
+  <w:abstractNum w:abstractNumId="39" w15:restartNumberingAfterBreak="0">
     <w:nsid w:val="6AE35176"/>
     <w:multiLevelType w:val="hybridMultilevel"/>
     <w:tmpl w:val="F2CE4EBC"/>
@@ -17423,7 +17156,7 @@
       </w:pPr>
     </w:lvl>
   </w:abstractNum>
-  <w:abstractNum w:abstractNumId="39" w15:restartNumberingAfterBreak="0">
+  <w:abstractNum w:abstractNumId="40" w15:restartNumberingAfterBreak="0">
     <w:nsid w:val="6E864EE5"/>
     <w:multiLevelType w:val="hybridMultilevel"/>
     <w:tmpl w:val="CFE4EA78"/>
@@ -17536,7 +17269,7 @@
       </w:rPr>
     </w:lvl>
   </w:abstractNum>
-  <w:abstractNum w:abstractNumId="40" w15:restartNumberingAfterBreak="0">
+  <w:abstractNum w:abstractNumId="41" w15:restartNumberingAfterBreak="0">
     <w:nsid w:val="6F782727"/>
     <w:multiLevelType w:val="multilevel"/>
     <w:tmpl w:val="8B0AA3D0"/>
@@ -17685,7 +17418,7 @@
       </w:rPr>
     </w:lvl>
   </w:abstractNum>
-  <w:abstractNum w:abstractNumId="41" w15:restartNumberingAfterBreak="0">
+  <w:abstractNum w:abstractNumId="42" w15:restartNumberingAfterBreak="0">
     <w:nsid w:val="70B11921"/>
     <w:multiLevelType w:val="multilevel"/>
     <w:tmpl w:val="64544E86"/>
@@ -17834,7 +17567,7 @@
       </w:rPr>
     </w:lvl>
   </w:abstractNum>
-  <w:abstractNum w:abstractNumId="42" w15:restartNumberingAfterBreak="0">
+  <w:abstractNum w:abstractNumId="43" w15:restartNumberingAfterBreak="0">
     <w:nsid w:val="734A3DA3"/>
     <w:multiLevelType w:val="hybridMultilevel"/>
     <w:tmpl w:val="94EA3ED2"/>
@@ -17947,7 +17680,7 @@
       </w:rPr>
     </w:lvl>
   </w:abstractNum>
-  <w:abstractNum w:abstractNumId="43" w15:restartNumberingAfterBreak="0">
+  <w:abstractNum w:abstractNumId="44" w15:restartNumberingAfterBreak="0">
     <w:nsid w:val="73B9401D"/>
     <w:multiLevelType w:val="multilevel"/>
     <w:tmpl w:val="A33267B8"/>
@@ -18096,7 +17829,7 @@
       </w:rPr>
     </w:lvl>
   </w:abstractNum>
-  <w:abstractNum w:abstractNumId="44" w15:restartNumberingAfterBreak="0">
+  <w:abstractNum w:abstractNumId="45" w15:restartNumberingAfterBreak="0">
     <w:nsid w:val="74972380"/>
     <w:multiLevelType w:val="hybridMultilevel"/>
     <w:tmpl w:val="6964900E"/>
@@ -18185,7 +17918,7 @@
       </w:pPr>
     </w:lvl>
   </w:abstractNum>
-  <w:abstractNum w:abstractNumId="45" w15:restartNumberingAfterBreak="0">
+  <w:abstractNum w:abstractNumId="46" w15:restartNumberingAfterBreak="0">
     <w:nsid w:val="751B5569"/>
     <w:multiLevelType w:val="multilevel"/>
     <w:tmpl w:val="B4221C90"/>
@@ -18334,7 +18067,7 @@
       </w:rPr>
     </w:lvl>
   </w:abstractNum>
-  <w:abstractNum w:abstractNumId="46" w15:restartNumberingAfterBreak="0">
+  <w:abstractNum w:abstractNumId="47" w15:restartNumberingAfterBreak="0">
     <w:nsid w:val="790F1487"/>
     <w:multiLevelType w:val="multilevel"/>
     <w:tmpl w:val="5EA6606A"/>
@@ -18483,7 +18216,7 @@
       </w:rPr>
     </w:lvl>
   </w:abstractNum>
-  <w:abstractNum w:abstractNumId="47" w15:restartNumberingAfterBreak="0">
+  <w:abstractNum w:abstractNumId="48" w15:restartNumberingAfterBreak="0">
     <w:nsid w:val="791610BD"/>
     <w:multiLevelType w:val="multilevel"/>
     <w:tmpl w:val="C3E80F32"/>
@@ -18632,7 +18365,7 @@
       </w:rPr>
     </w:lvl>
   </w:abstractNum>
-  <w:abstractNum w:abstractNumId="48" w15:restartNumberingAfterBreak="0">
+  <w:abstractNum w:abstractNumId="49" w15:restartNumberingAfterBreak="0">
     <w:nsid w:val="7FF371BD"/>
     <w:multiLevelType w:val="multilevel"/>
     <w:tmpl w:val="53CAD14C"/>
@@ -18785,7 +18518,7 @@
     <w:abstractNumId w:val="13"/>
   </w:num>
   <w:num w:numId="2" w16cid:durableId="1302618494">
-    <w:abstractNumId w:val="39"/>
+    <w:abstractNumId w:val="40"/>
   </w:num>
   <w:num w:numId="3" w16cid:durableId="785274669">
     <w:abstractNumId w:val="8"/>
@@ -18800,10 +18533,10 @@
     <w:abstractNumId w:val="0"/>
   </w:num>
   <w:num w:numId="7" w16cid:durableId="611128390">
-    <w:abstractNumId w:val="47"/>
+    <w:abstractNumId w:val="48"/>
   </w:num>
   <w:num w:numId="8" w16cid:durableId="1073553026">
-    <w:abstractNumId w:val="43"/>
+    <w:abstractNumId w:val="44"/>
   </w:num>
   <w:num w:numId="9" w16cid:durableId="1331446595">
     <w:abstractNumId w:val="7"/>
@@ -18812,67 +18545,67 @@
     <w:abstractNumId w:val="19"/>
   </w:num>
   <w:num w:numId="11" w16cid:durableId="1929457162">
-    <w:abstractNumId w:val="28"/>
+    <w:abstractNumId w:val="29"/>
   </w:num>
   <w:num w:numId="12" w16cid:durableId="2144540827">
-    <w:abstractNumId w:val="45"/>
+    <w:abstractNumId w:val="46"/>
   </w:num>
   <w:num w:numId="13" w16cid:durableId="309286864">
     <w:abstractNumId w:val="14"/>
   </w:num>
   <w:num w:numId="14" w16cid:durableId="1396051446">
-    <w:abstractNumId w:val="32"/>
+    <w:abstractNumId w:val="33"/>
   </w:num>
   <w:num w:numId="15" w16cid:durableId="251010204">
-    <w:abstractNumId w:val="44"/>
+    <w:abstractNumId w:val="45"/>
   </w:num>
   <w:num w:numId="16" w16cid:durableId="672882311">
-    <w:abstractNumId w:val="30"/>
+    <w:abstractNumId w:val="31"/>
   </w:num>
   <w:num w:numId="17" w16cid:durableId="1352295667">
     <w:abstractNumId w:val="11"/>
   </w:num>
   <w:num w:numId="18" w16cid:durableId="2143034443">
-    <w:abstractNumId w:val="24"/>
+    <w:abstractNumId w:val="25"/>
   </w:num>
   <w:num w:numId="19" w16cid:durableId="1172720809">
     <w:abstractNumId w:val="1"/>
   </w:num>
   <w:num w:numId="20" w16cid:durableId="1780831196">
-    <w:abstractNumId w:val="41"/>
+    <w:abstractNumId w:val="42"/>
   </w:num>
   <w:num w:numId="21" w16cid:durableId="1716588376">
     <w:abstractNumId w:val="21"/>
   </w:num>
   <w:num w:numId="22" w16cid:durableId="1217550963">
-    <w:abstractNumId w:val="35"/>
+    <w:abstractNumId w:val="36"/>
   </w:num>
   <w:num w:numId="23" w16cid:durableId="2103410047">
-    <w:abstractNumId w:val="48"/>
+    <w:abstractNumId w:val="49"/>
   </w:num>
   <w:num w:numId="24" w16cid:durableId="68623947">
     <w:abstractNumId w:val="20"/>
   </w:num>
   <w:num w:numId="25" w16cid:durableId="453520952">
-    <w:abstractNumId w:val="34"/>
+    <w:abstractNumId w:val="35"/>
   </w:num>
   <w:num w:numId="26" w16cid:durableId="1802722075">
-    <w:abstractNumId w:val="46"/>
+    <w:abstractNumId w:val="47"/>
     <w:lvlOverride w:ilvl="0">
       <w:startOverride w:val="1"/>
     </w:lvlOverride>
   </w:num>
   <w:num w:numId="27" w16cid:durableId="1425109365">
-    <w:abstractNumId w:val="46"/>
+    <w:abstractNumId w:val="47"/>
     <w:lvlOverride w:ilvl="0">
       <w:startOverride w:val="2"/>
     </w:lvlOverride>
   </w:num>
   <w:num w:numId="28" w16cid:durableId="1167398195">
-    <w:abstractNumId w:val="38"/>
+    <w:abstractNumId w:val="39"/>
   </w:num>
   <w:num w:numId="29" w16cid:durableId="807745001">
-    <w:abstractNumId w:val="36"/>
+    <w:abstractNumId w:val="37"/>
   </w:num>
   <w:num w:numId="30" w16cid:durableId="1834493637">
     <w:abstractNumId w:val="10"/>
@@ -18899,16 +18632,16 @@
     </w:lvlOverride>
   </w:num>
   <w:num w:numId="34" w16cid:durableId="1843815973">
-    <w:abstractNumId w:val="40"/>
+    <w:abstractNumId w:val="41"/>
   </w:num>
   <w:num w:numId="35" w16cid:durableId="1354303931">
-    <w:abstractNumId w:val="42"/>
+    <w:abstractNumId w:val="43"/>
   </w:num>
   <w:num w:numId="36" w16cid:durableId="1404984249">
     <w:abstractNumId w:val="15"/>
   </w:num>
   <w:num w:numId="37" w16cid:durableId="1253587883">
-    <w:abstractNumId w:val="29"/>
+    <w:abstractNumId w:val="30"/>
   </w:num>
   <w:num w:numId="38" w16cid:durableId="1776438499">
     <w:abstractNumId w:val="9"/>
@@ -18920,10 +18653,10 @@
     <w:abstractNumId w:val="2"/>
   </w:num>
   <w:num w:numId="41" w16cid:durableId="1856457233">
-    <w:abstractNumId w:val="22"/>
+    <w:abstractNumId w:val="23"/>
   </w:num>
   <w:num w:numId="42" w16cid:durableId="891428175">
-    <w:abstractNumId w:val="33"/>
+    <w:abstractNumId w:val="34"/>
   </w:num>
   <w:num w:numId="43" w16cid:durableId="40593586">
     <w:abstractNumId w:val="17"/>
@@ -18932,13 +18665,13 @@
     <w:abstractNumId w:val="12"/>
   </w:num>
   <w:num w:numId="45" w16cid:durableId="98721298">
-    <w:abstractNumId w:val="23"/>
+    <w:abstractNumId w:val="24"/>
   </w:num>
   <w:num w:numId="46" w16cid:durableId="451365161">
-    <w:abstractNumId w:val="31"/>
+    <w:abstractNumId w:val="32"/>
   </w:num>
   <w:num w:numId="47" w16cid:durableId="982809870">
-    <w:abstractNumId w:val="26"/>
+    <w:abstractNumId w:val="27"/>
   </w:num>
   <w:num w:numId="48" w16cid:durableId="1795831719">
     <w:abstractNumId w:val="16"/>
@@ -18950,13 +18683,55 @@
     <w:abstractNumId w:val="18"/>
   </w:num>
   <w:num w:numId="51" w16cid:durableId="736395153">
-    <w:abstractNumId w:val="25"/>
+    <w:abstractNumId w:val="26"/>
   </w:num>
   <w:num w:numId="52" w16cid:durableId="1597248562">
-    <w:abstractNumId w:val="27"/>
+    <w:abstractNumId w:val="28"/>
   </w:num>
   <w:num w:numId="53" w16cid:durableId="207113473">
-    <w:abstractNumId w:val="37"/>
+    <w:abstractNumId w:val="38"/>
+  </w:num>
+  <w:num w:numId="54" w16cid:durableId="178155591">
+    <w:abstractNumId w:val="22"/>
+    <w:lvlOverride w:ilvl="0">
+      <w:startOverride w:val="1"/>
+    </w:lvlOverride>
+  </w:num>
+  <w:num w:numId="55" w16cid:durableId="1249343686">
+    <w:abstractNumId w:val="22"/>
+    <w:lvlOverride w:ilvl="0">
+      <w:startOverride w:val="2"/>
+    </w:lvlOverride>
+  </w:num>
+  <w:num w:numId="56" w16cid:durableId="2102335334">
+    <w:abstractNumId w:val="22"/>
+    <w:lvlOverride w:ilvl="0">
+      <w:startOverride w:val="3"/>
+    </w:lvlOverride>
+  </w:num>
+  <w:num w:numId="57" w16cid:durableId="7606488">
+    <w:abstractNumId w:val="22"/>
+    <w:lvlOverride w:ilvl="0">
+      <w:startOverride w:val="4"/>
+    </w:lvlOverride>
+  </w:num>
+  <w:num w:numId="58" w16cid:durableId="42751421">
+    <w:abstractNumId w:val="22"/>
+    <w:lvlOverride w:ilvl="0">
+      <w:startOverride w:val="5"/>
+    </w:lvlOverride>
+  </w:num>
+  <w:num w:numId="59" w16cid:durableId="859200398">
+    <w:abstractNumId w:val="22"/>
+    <w:lvlOverride w:ilvl="0">
+      <w:startOverride w:val="6"/>
+    </w:lvlOverride>
+  </w:num>
+  <w:num w:numId="60" w16cid:durableId="888423324">
+    <w:abstractNumId w:val="22"/>
+    <w:lvlOverride w:ilvl="0">
+      <w:startOverride w:val="7"/>
+    </w:lvlOverride>
   </w:num>
 </w:numbering>
 </file>

</xml_diff>